<commit_message>
docs: cover failed funding and project cancellation
</commit_message>
<xml_diff>
--- a/docs/acceptance-testing-program.docx
+++ b/docs/acceptance-testing-program.docx
@@ -163,9 +163,9 @@
             </w:pPr>
             <w:r>
               <w:rPr>
-                <w:rFonts w:ascii="Calibri" w:hAnsi="Calibri"/>
+                <w:rFonts w:ascii="Calibri" w:hAnsi="Calibri" w:eastAsia="Calibri"/>
                 <w:b/>
-                <w:color w:val="2E74B5"/>
+                <w:color w:val="0070C0"/>
                 <w:sz w:val="15"/>
               </w:rPr>
               <w:t>GOV-01. Смена собственника и долевая собственность</w:t>
@@ -190,9 +190,9 @@
             </w:pPr>
             <w:r>
               <w:rPr>
-                <w:rFonts w:ascii="Calibri" w:hAnsi="Calibri"/>
+                <w:rFonts w:ascii="Calibri" w:hAnsi="Calibri" w:eastAsia="Calibri"/>
                 <w:b w:val="0"/>
-                <w:color w:val="243447"/>
+                <w:color w:val="24364B"/>
                 <w:sz w:val="15"/>
               </w:rPr>
               <w:t>Есть заявка на привязку жителя к участку и подтверждение председателем. Участок может быть связан только с одним участником; доли, несколько собственников, передача участка и сохранение цепочки владельцев отсутствуют.</w:t>
@@ -218,9 +218,9 @@
             </w:pPr>
             <w:r>
               <w:rPr>
-                <w:rFonts w:ascii="Calibri" w:hAnsi="Calibri"/>
+                <w:rFonts w:ascii="Calibri" w:hAnsi="Calibri" w:eastAsia="Calibri"/>
                 <w:b/>
-                <w:color w:val="7A5A00"/>
+                <w:color w:val="7F6000"/>
                 <w:sz w:val="15"/>
               </w:rPr>
               <w:t>Частично</w:t>
@@ -245,9 +245,9 @@
             </w:pPr>
             <w:r>
               <w:rPr>
-                <w:rFonts w:ascii="Calibri" w:hAnsi="Calibri"/>
+                <w:rFonts w:ascii="Calibri" w:hAnsi="Calibri" w:eastAsia="Calibri"/>
                 <w:b w:val="0"/>
-                <w:color w:val="265A61"/>
+                <w:color w:val="255E69"/>
                 <w:sz w:val="15"/>
               </w:rPr>
               <w:t>Заменить одиночную связь участника с участком на записи владения с долей и периодом действия. Историю и текущих владельцев показывать в раскрывающемся блоке карточки участка.</w:t>
@@ -277,9 +277,9 @@
             </w:pPr>
             <w:r>
               <w:rPr>
-                <w:rFonts w:ascii="Calibri" w:hAnsi="Calibri"/>
+                <w:rFonts w:ascii="Calibri" w:hAnsi="Calibri" w:eastAsia="Calibri"/>
                 <w:b/>
-                <w:color w:val="2E74B5"/>
+                <w:color w:val="0070C0"/>
                 <w:sz w:val="15"/>
               </w:rPr>
               <w:t>GOV-02. Временный доступ арендатора или члена семьи</w:t>
@@ -304,9 +304,9 @@
             </w:pPr>
             <w:r>
               <w:rPr>
-                <w:rFonts w:ascii="Calibri" w:hAnsi="Calibri"/>
+                <w:rFonts w:ascii="Calibri" w:hAnsi="Calibri" w:eastAsia="Calibri"/>
                 <w:b w:val="0"/>
-                <w:color w:val="243447"/>
+                <w:color w:val="24364B"/>
                 <w:sz w:val="15"/>
               </w:rPr>
               <w:t>Можно назначить обычную роль и вручную приостановить доступ. Нет роли арендатора, разрешений по отдельным функциям, срока действия и автоматического отзыва.</w:t>
@@ -332,9 +332,9 @@
             </w:pPr>
             <w:r>
               <w:rPr>
-                <w:rFonts w:ascii="Calibri" w:hAnsi="Calibri"/>
+                <w:rFonts w:ascii="Calibri" w:hAnsi="Calibri" w:eastAsia="Calibri"/>
                 <w:b/>
-                <w:color w:val="7A5A00"/>
+                <w:color w:val="7F6000"/>
                 <w:sz w:val="15"/>
               </w:rPr>
               <w:t>Частично</w:t>
@@ -359,9 +359,9 @@
             </w:pPr>
             <w:r>
               <w:rPr>
-                <w:rFonts w:ascii="Calibri" w:hAnsi="Calibri"/>
+                <w:rFonts w:ascii="Calibri" w:hAnsi="Calibri" w:eastAsia="Calibri"/>
                 <w:b w:val="0"/>
-                <w:color w:val="265A61"/>
+                <w:color w:val="255E69"/>
                 <w:sz w:val="15"/>
               </w:rPr>
               <w:t>Добавить пресеты доступа «арендатор» и «член семьи» со сроком окончания. Настройку разместить в существующем диалоге участника, отзыв выполнять автоматически.</w:t>
@@ -391,9 +391,9 @@
             </w:pPr>
             <w:r>
               <w:rPr>
-                <w:rFonts w:ascii="Calibri" w:hAnsi="Calibri"/>
+                <w:rFonts w:ascii="Calibri" w:hAnsi="Calibri" w:eastAsia="Calibri"/>
                 <w:b/>
-                <w:color w:val="2E74B5"/>
+                <w:color w:val="0070C0"/>
                 <w:sz w:val="15"/>
               </w:rPr>
               <w:t>GOV-03. Наследование и участок без подтвержденного собственника</w:t>
@@ -418,9 +418,9 @@
             </w:pPr>
             <w:r>
               <w:rPr>
-                <w:rFonts w:ascii="Calibri" w:hAnsi="Calibri"/>
+                <w:rFonts w:ascii="Calibri" w:hAnsi="Calibri" w:eastAsia="Calibri"/>
                 <w:b w:val="0"/>
-                <w:color w:val="243447"/>
+                <w:color w:val="24364B"/>
                 <w:sz w:val="15"/>
               </w:rPr>
               <w:t>Участок может временно не иметь участника, но нет переходного статуса, наследственного процесса, временного контактного лица и ограничения права голоса до подтверждения наследства.</w:t>
@@ -446,9 +446,9 @@
             </w:pPr>
             <w:r>
               <w:rPr>
-                <w:rFonts w:ascii="Calibri" w:hAnsi="Calibri"/>
+                <w:rFonts w:ascii="Calibri" w:hAnsi="Calibri" w:eastAsia="Calibri"/>
                 <w:b/>
-                <w:color w:val="9B1C1C"/>
+                <w:color w:val="A61C1C"/>
                 <w:sz w:val="15"/>
               </w:rPr>
               <w:t>Нет</w:t>
@@ -473,9 +473,9 @@
             </w:pPr>
             <w:r>
               <w:rPr>
-                <w:rFonts w:ascii="Calibri" w:hAnsi="Calibri"/>
+                <w:rFonts w:ascii="Calibri" w:hAnsi="Calibri" w:eastAsia="Calibri"/>
                 <w:b w:val="0"/>
-                <w:color w:val="265A61"/>
+                <w:color w:val="255E69"/>
                 <w:sz w:val="15"/>
               </w:rPr>
               <w:t>Ввести у участка статус «право собственности уточняется», временного контактного лица и автоматический запрет голоса. Все поля разместить в карточке участка без отдельного процесса или экрана.</w:t>
@@ -505,9 +505,9 @@
             </w:pPr>
             <w:r>
               <w:rPr>
-                <w:rFonts w:ascii="Calibri" w:hAnsi="Calibri"/>
+                <w:rFonts w:ascii="Calibri" w:hAnsi="Calibri" w:eastAsia="Calibri"/>
                 <w:b/>
-                <w:color w:val="2E74B5"/>
+                <w:color w:val="0070C0"/>
                 <w:sz w:val="15"/>
               </w:rPr>
               <w:t>GOV-04. Передача дел новому председателю</w:t>
@@ -532,9 +532,9 @@
             </w:pPr>
             <w:r>
               <w:rPr>
-                <w:rFonts w:ascii="Calibri" w:hAnsi="Calibri"/>
+                <w:rFonts w:ascii="Calibri" w:hAnsi="Calibri" w:eastAsia="Calibri"/>
                 <w:b w:val="0"/>
-                <w:color w:val="243447"/>
+                <w:color w:val="24364B"/>
                 <w:sz w:val="15"/>
               </w:rPr>
               <w:t>Администратор может изменить роли; система не позволяет оставить поселок без активного председателя, а действия сохраняются в аудите. Нет процедуры передачи дел, контрольного перечня обязательств, даты вступления полномочий и акта передачи.</w:t>
@@ -560,9 +560,9 @@
             </w:pPr>
             <w:r>
               <w:rPr>
-                <w:rFonts w:ascii="Calibri" w:hAnsi="Calibri"/>
+                <w:rFonts w:ascii="Calibri" w:hAnsi="Calibri" w:eastAsia="Calibri"/>
                 <w:b/>
-                <w:color w:val="7A5A00"/>
+                <w:color w:val="7F6000"/>
                 <w:sz w:val="15"/>
               </w:rPr>
               <w:t>Частично</w:t>
@@ -587,9 +587,9 @@
             </w:pPr>
             <w:r>
               <w:rPr>
-                <w:rFonts w:ascii="Calibri" w:hAnsi="Calibri"/>
+                <w:rFonts w:ascii="Calibri" w:hAnsi="Calibri" w:eastAsia="Calibri"/>
                 <w:b w:val="0"/>
-                <w:color w:val="265A61"/>
+                <w:color w:val="255E69"/>
                 <w:sz w:val="15"/>
               </w:rPr>
               <w:t>При смене председателя запускать шаблон передачи дел: дата полномочий, контрольный список, незакрытые задачи и итоговый документ. Использовать существующие задачи, файлы и аудит.</w:t>
@@ -619,9 +619,9 @@
             </w:pPr>
             <w:r>
               <w:rPr>
-                <w:rFonts w:ascii="Calibri" w:hAnsi="Calibri"/>
+                <w:rFonts w:ascii="Calibri" w:hAnsi="Calibri" w:eastAsia="Calibri"/>
                 <w:b/>
-                <w:color w:val="2E74B5"/>
+                <w:color w:val="0070C0"/>
                 <w:sz w:val="15"/>
               </w:rPr>
               <w:t>GOV-05. Временное делегирование полномочий</w:t>
@@ -646,9 +646,9 @@
             </w:pPr>
             <w:r>
               <w:rPr>
-                <w:rFonts w:ascii="Calibri" w:hAnsi="Calibri"/>
+                <w:rFonts w:ascii="Calibri" w:hAnsi="Calibri" w:eastAsia="Calibri"/>
                 <w:b w:val="0"/>
-                <w:color w:val="243447"/>
+                <w:color w:val="24364B"/>
                 <w:sz w:val="15"/>
               </w:rPr>
               <w:t>Есть роль помощника председателя с ограниченными правами. Нет делегирования на срок, индивидуального набора разрешений, лимита суммы и последующего подтверждения аварийной операции.</w:t>
@@ -674,9 +674,9 @@
             </w:pPr>
             <w:r>
               <w:rPr>
-                <w:rFonts w:ascii="Calibri" w:hAnsi="Calibri"/>
+                <w:rFonts w:ascii="Calibri" w:hAnsi="Calibri" w:eastAsia="Calibri"/>
                 <w:b/>
-                <w:color w:val="7A5A00"/>
+                <w:color w:val="7F6000"/>
                 <w:sz w:val="15"/>
               </w:rPr>
               <w:t>Частично</w:t>
@@ -701,9 +701,9 @@
             </w:pPr>
             <w:r>
               <w:rPr>
-                <w:rFonts w:ascii="Calibri" w:hAnsi="Calibri"/>
+                <w:rFonts w:ascii="Calibri" w:hAnsi="Calibri" w:eastAsia="Calibri"/>
                 <w:b w:val="0"/>
-                <w:color w:val="265A61"/>
+                <w:color w:val="255E69"/>
                 <w:sz w:val="15"/>
               </w:rPr>
               <w:t>Добавить временное разрешение к существующей роли: срок, набор действий и денежный лимит. Управлять им из текущего диалога ролей, аварийные действия выводить председателю на подтверждение.</w:t>
@@ -894,9 +894,9 @@
             </w:pPr>
             <w:r>
               <w:rPr>
-                <w:rFonts w:ascii="Calibri" w:hAnsi="Calibri"/>
+                <w:rFonts w:ascii="Calibri" w:hAnsi="Calibri" w:eastAsia="Calibri"/>
                 <w:b/>
-                <w:color w:val="2E74B5"/>
+                <w:color w:val="0070C0"/>
                 <w:sz w:val="15"/>
               </w:rPr>
               <w:t>GOV-06. Собрание, кворум, доверенности и оспаривание</w:t>
@@ -921,9 +921,9 @@
             </w:pPr>
             <w:r>
               <w:rPr>
-                <w:rFonts w:ascii="Calibri" w:hAnsi="Calibri"/>
+                <w:rFonts w:ascii="Calibri" w:hAnsi="Calibri" w:eastAsia="Calibri"/>
                 <w:b w:val="0"/>
-                <w:color w:val="243447"/>
+                <w:color w:val="24364B"/>
                 <w:sz w:val="15"/>
               </w:rPr>
               <w:t>Опрос считает кворум и процент поддержки, хранит один голос участника и блокирует создание проекта до успешного завершения. Нет долевого учета, доверенностей, бюллетеней, воздержания, реестра имеющих право, пересчета и юридически значимого протокола.</w:t>
@@ -949,9 +949,9 @@
             </w:pPr>
             <w:r>
               <w:rPr>
-                <w:rFonts w:ascii="Calibri" w:hAnsi="Calibri"/>
+                <w:rFonts w:ascii="Calibri" w:hAnsi="Calibri" w:eastAsia="Calibri"/>
                 <w:b/>
-                <w:color w:val="7A5A00"/>
+                <w:color w:val="7F6000"/>
                 <w:sz w:val="15"/>
               </w:rPr>
               <w:t>Частично</w:t>
@@ -976,9 +976,9 @@
             </w:pPr>
             <w:r>
               <w:rPr>
-                <w:rFonts w:ascii="Calibri" w:hAnsi="Calibri"/>
+                <w:rFonts w:ascii="Calibri" w:hAnsi="Calibri" w:eastAsia="Calibri"/>
                 <w:b w:val="0"/>
-                <w:color w:val="265A61"/>
+                <w:color w:val="255E69"/>
                 <w:sz w:val="15"/>
               </w:rPr>
               <w:t>Расширить опрос режимом «собрание»: зафиксированный список имеющих право, доля, доверенность, воздержание и протокол. Поля открывать в дополнительных настройках того же опроса.</w:t>
@@ -1008,9 +1008,9 @@
             </w:pPr>
             <w:r>
               <w:rPr>
-                <w:rFonts w:ascii="Calibri" w:hAnsi="Calibri"/>
+                <w:rFonts w:ascii="Calibri" w:hAnsi="Calibri" w:eastAsia="Calibri"/>
                 <w:b/>
-                <w:color w:val="2E74B5"/>
+                <w:color w:val="0070C0"/>
                 <w:sz w:val="15"/>
               </w:rPr>
               <w:t>GOV-07. Решение правления и контроль исполнения</w:t>
@@ -1035,9 +1035,9 @@
             </w:pPr>
             <w:r>
               <w:rPr>
-                <w:rFonts w:ascii="Calibri" w:hAnsi="Calibri"/>
+                <w:rFonts w:ascii="Calibri" w:hAnsi="Calibri" w:eastAsia="Calibri"/>
                 <w:b w:val="0"/>
-                <w:color w:val="243447"/>
+                <w:color w:val="24364B"/>
                 <w:sz w:val="15"/>
               </w:rPr>
               <w:t>Есть реестр решений, статусы, результат исполнения и связи с проектами и документами. У решения нет ответственного, срока, задач, напоминаний и отдельной истории переходов статуса.</w:t>
@@ -1063,9 +1063,9 @@
             </w:pPr>
             <w:r>
               <w:rPr>
-                <w:rFonts w:ascii="Calibri" w:hAnsi="Calibri"/>
+                <w:rFonts w:ascii="Calibri" w:hAnsi="Calibri" w:eastAsia="Calibri"/>
                 <w:b/>
-                <w:color w:val="7A5A00"/>
+                <w:color w:val="7F6000"/>
                 <w:sz w:val="15"/>
               </w:rPr>
               <w:t>Частично</w:t>
@@ -1090,9 +1090,9 @@
             </w:pPr>
             <w:r>
               <w:rPr>
-                <w:rFonts w:ascii="Calibri" w:hAnsi="Calibri"/>
+                <w:rFonts w:ascii="Calibri" w:hAnsi="Calibri" w:eastAsia="Calibri"/>
                 <w:b w:val="0"/>
-                <w:color w:val="265A61"/>
+                <w:color w:val="255E69"/>
                 <w:sz w:val="15"/>
               </w:rPr>
               <w:t>Добавить решению ответственного, срок и связанные обычные задачи; историю строить из существующего аудита. В карточке решения показывать компактный блок исполнения.</w:t>
@@ -1122,9 +1122,9 @@
             </w:pPr>
             <w:r>
               <w:rPr>
-                <w:rFonts w:ascii="Calibri" w:hAnsi="Calibri"/>
+                <w:rFonts w:ascii="Calibri" w:hAnsi="Calibri" w:eastAsia="Calibri"/>
                 <w:b/>
-                <w:color w:val="2E74B5"/>
+                <w:color w:val="0070C0"/>
                 <w:sz w:val="15"/>
               </w:rPr>
               <w:t>FIN-01. Массовое ежемесячное начисление</w:t>
@@ -1149,9 +1149,9 @@
             </w:pPr>
             <w:r>
               <w:rPr>
-                <w:rFonts w:ascii="Calibri" w:hAnsi="Calibri"/>
+                <w:rFonts w:ascii="Calibri" w:hAnsi="Calibri" w:eastAsia="Calibri"/>
                 <w:b w:val="0"/>
-                <w:color w:val="243447"/>
+                <w:color w:val="24364B"/>
                 <w:sz w:val="15"/>
               </w:rPr>
               <w:t>Председатель может создать начисление конкретному жителю и участку. Нет массового запуска, тарифов, льгот, индивидуальных оснований, контроля дублей и перерасчета части периода.</w:t>
@@ -1177,9 +1177,9 @@
             </w:pPr>
             <w:r>
               <w:rPr>
-                <w:rFonts w:ascii="Calibri" w:hAnsi="Calibri"/>
+                <w:rFonts w:ascii="Calibri" w:hAnsi="Calibri" w:eastAsia="Calibri"/>
                 <w:b/>
-                <w:color w:val="7A5A00"/>
+                <w:color w:val="7F6000"/>
                 <w:sz w:val="15"/>
               </w:rPr>
               <w:t>Частично</w:t>
@@ -1204,9 +1204,9 @@
             </w:pPr>
             <w:r>
               <w:rPr>
-                <w:rFonts w:ascii="Calibri" w:hAnsi="Calibri"/>
+                <w:rFonts w:ascii="Calibri" w:hAnsi="Calibri" w:eastAsia="Calibri"/>
                 <w:b w:val="0"/>
-                <w:color w:val="265A61"/>
+                <w:color w:val="255E69"/>
                 <w:sz w:val="15"/>
               </w:rPr>
               <w:t>Создать шаблоны начислений с тарифом, льготой и правилами перерасчета. В текущем финансовом разделе добавить действие «Начислить по шаблону» с предпросмотром и исключениями.</w:t>
@@ -1236,9 +1236,9 @@
             </w:pPr>
             <w:r>
               <w:rPr>
-                <w:rFonts w:ascii="Calibri" w:hAnsi="Calibri"/>
+                <w:rFonts w:ascii="Calibri" w:hAnsi="Calibri" w:eastAsia="Calibri"/>
                 <w:b/>
-                <w:color w:val="2E74B5"/>
+                <w:color w:val="0070C0"/>
                 <w:sz w:val="15"/>
               </w:rPr>
               <w:t>FIN-02. Полная, частичная, неопознанная и задвоенная оплата</w:t>
@@ -1263,9 +1263,9 @@
             </w:pPr>
             <w:r>
               <w:rPr>
-                <w:rFonts w:ascii="Calibri" w:hAnsi="Calibri"/>
+                <w:rFonts w:ascii="Calibri" w:hAnsi="Calibri" w:eastAsia="Calibri"/>
                 <w:b w:val="0"/>
-                <w:color w:val="243447"/>
+                <w:color w:val="24364B"/>
                 <w:sz w:val="15"/>
               </w:rPr>
               <w:t>Частичные платежи суммируются и меняют статус начисления. Нет банковского импорта, нераспознанных платежей, защиты от дубля, авансового остатка и корректного распределения переплаты.</w:t>
@@ -1291,9 +1291,9 @@
             </w:pPr>
             <w:r>
               <w:rPr>
-                <w:rFonts w:ascii="Calibri" w:hAnsi="Calibri"/>
+                <w:rFonts w:ascii="Calibri" w:hAnsi="Calibri" w:eastAsia="Calibri"/>
                 <w:b/>
-                <w:color w:val="7A5A00"/>
+                <w:color w:val="7F6000"/>
                 <w:sz w:val="15"/>
               </w:rPr>
               <w:t>Частично</w:t>
@@ -1318,9 +1318,9 @@
             </w:pPr>
             <w:r>
               <w:rPr>
-                <w:rFonts w:ascii="Calibri" w:hAnsi="Calibri"/>
+                <w:rFonts w:ascii="Calibri" w:hAnsi="Calibri" w:eastAsia="Calibri"/>
                 <w:b w:val="0"/>
-                <w:color w:val="265A61"/>
+                <w:color w:val="255E69"/>
                 <w:sz w:val="15"/>
               </w:rPr>
               <w:t>Добавить импорт банковской выписки во входящую очередь, автоматическое сопоставление, защиту от дублей и авансовый остаток. Несопоставленные операции показывать фильтром в реестре платежей.</w:t>
@@ -1350,9 +1350,9 @@
             </w:pPr>
             <w:r>
               <w:rPr>
-                <w:rFonts w:ascii="Calibri" w:hAnsi="Calibri"/>
+                <w:rFonts w:ascii="Calibri" w:hAnsi="Calibri" w:eastAsia="Calibri"/>
                 <w:b/>
-                <w:color w:val="2E74B5"/>
+                <w:color w:val="0070C0"/>
                 <w:sz w:val="15"/>
               </w:rPr>
               <w:t>FIN-03. Сверка долга, спор и рассрочка</w:t>
@@ -1377,9 +1377,9 @@
             </w:pPr>
             <w:r>
               <w:rPr>
-                <w:rFonts w:ascii="Calibri" w:hAnsi="Calibri"/>
+                <w:rFonts w:ascii="Calibri" w:hAnsi="Calibri" w:eastAsia="Calibri"/>
                 <w:b w:val="0"/>
-                <w:color w:val="243447"/>
+                <w:color w:val="24364B"/>
                 <w:sz w:val="15"/>
               </w:rPr>
               <w:t>Житель видит начисления и платежи, председатель — общий долг. Нет акта сверки, спорной суммы, поиска платежа, графика рассрочки, пени и претензионного процесса.</w:t>
@@ -1405,9 +1405,9 @@
             </w:pPr>
             <w:r>
               <w:rPr>
-                <w:rFonts w:ascii="Calibri" w:hAnsi="Calibri"/>
+                <w:rFonts w:ascii="Calibri" w:hAnsi="Calibri" w:eastAsia="Calibri"/>
                 <w:b/>
-                <w:color w:val="7A5A00"/>
+                <w:color w:val="7F6000"/>
                 <w:sz w:val="15"/>
               </w:rPr>
               <w:t>Частично</w:t>
@@ -1432,9 +1432,9 @@
             </w:pPr>
             <w:r>
               <w:rPr>
-                <w:rFonts w:ascii="Calibri" w:hAnsi="Calibri"/>
+                <w:rFonts w:ascii="Calibri" w:hAnsi="Calibri" w:eastAsia="Calibri"/>
                 <w:b w:val="0"/>
-                <w:color w:val="265A61"/>
+                <w:color w:val="255E69"/>
                 <w:sz w:val="15"/>
               </w:rPr>
               <w:t>Из истории жителя открывать единый диалог «Сверка и урегулирование»: акт, спорная сумма, найденный платеж и график рассрочки. Не создавать отдельный модуль претензий.</w:t>
@@ -1625,9 +1625,9 @@
             </w:pPr>
             <w:r>
               <w:rPr>
-                <w:rFonts w:ascii="Calibri" w:hAnsi="Calibri"/>
+                <w:rFonts w:ascii="Calibri" w:hAnsi="Calibri" w:eastAsia="Calibri"/>
                 <w:b/>
-                <w:color w:val="2E74B5"/>
+                <w:color w:val="0070C0"/>
                 <w:sz w:val="15"/>
               </w:rPr>
               <w:t>FIN-04. Возврат и перераспределение платежа</w:t>
@@ -1652,9 +1652,9 @@
             </w:pPr>
             <w:r>
               <w:rPr>
-                <w:rFonts w:ascii="Calibri" w:hAnsi="Calibri"/>
+                <w:rFonts w:ascii="Calibri" w:hAnsi="Calibri" w:eastAsia="Calibri"/>
                 <w:b w:val="0"/>
-                <w:color w:val="243447"/>
+                <w:color w:val="24364B"/>
                 <w:sz w:val="15"/>
               </w:rPr>
               <w:t>API возврата, сторнирования, переноса платежа между участками или зачета переплаты в другой сбор отсутствует. Удаление или ручная компенсирующая запись не оформлены как контролируемая операция.</w:t>
@@ -1680,9 +1680,9 @@
             </w:pPr>
             <w:r>
               <w:rPr>
-                <w:rFonts w:ascii="Calibri" w:hAnsi="Calibri"/>
+                <w:rFonts w:ascii="Calibri" w:hAnsi="Calibri" w:eastAsia="Calibri"/>
                 <w:b/>
-                <w:color w:val="9B1C1C"/>
+                <w:color w:val="A61C1C"/>
                 <w:sz w:val="15"/>
               </w:rPr>
               <w:t>Нет</w:t>
@@ -1707,9 +1707,9 @@
             </w:pPr>
             <w:r>
               <w:rPr>
-                <w:rFonts w:ascii="Calibri" w:hAnsi="Calibri"/>
+                <w:rFonts w:ascii="Calibri" w:hAnsi="Calibri" w:eastAsia="Calibri"/>
                 <w:b w:val="0"/>
-                <w:color w:val="265A61"/>
+                <w:color w:val="255E69"/>
                 <w:sz w:val="15"/>
               </w:rPr>
               <w:t>Реализовать неизменяемый финансовый журнал с операциями «сторно», «возврат», «перенос» и «зачет». Запускать их из меню платежа с обязательной причиной и записью в аудит.</w:t>
@@ -1739,9 +1739,9 @@
             </w:pPr>
             <w:r>
               <w:rPr>
-                <w:rFonts w:ascii="Calibri" w:hAnsi="Calibri"/>
+                <w:rFonts w:ascii="Calibri" w:hAnsi="Calibri" w:eastAsia="Calibri"/>
                 <w:b/>
-                <w:color w:val="2E74B5"/>
+                <w:color w:val="0070C0"/>
                 <w:sz w:val="15"/>
               </w:rPr>
               <w:t>FIN-05. Целевой сбор от решения до результата</w:t>
@@ -1766,9 +1766,9 @@
             </w:pPr>
             <w:r>
               <w:rPr>
-                <w:rFonts w:ascii="Calibri" w:hAnsi="Calibri"/>
+                <w:rFonts w:ascii="Calibri" w:hAnsi="Calibri" w:eastAsia="Calibri"/>
                 <w:b w:val="0"/>
-                <w:color w:val="243447"/>
+                <w:color w:val="24364B"/>
                 <w:sz w:val="15"/>
               </w:rPr>
               <w:t>Можно создать сбор, связать его с проектом, принимать взносы и автоматически считать прогресс. Нет разных сумм по категориям участков, порога начала проекта, связи с решением, возврата при отмене и распределения остатка.</w:t>
@@ -1794,9 +1794,9 @@
             </w:pPr>
             <w:r>
               <w:rPr>
-                <w:rFonts w:ascii="Calibri" w:hAnsi="Calibri"/>
+                <w:rFonts w:ascii="Calibri" w:hAnsi="Calibri" w:eastAsia="Calibri"/>
                 <w:b/>
-                <w:color w:val="7A5A00"/>
+                <w:color w:val="7F6000"/>
                 <w:sz w:val="15"/>
               </w:rPr>
               <w:t>Частично</w:t>
@@ -1821,9 +1821,9 @@
             </w:pPr>
             <w:r>
               <w:rPr>
-                <w:rFonts w:ascii="Calibri" w:hAnsi="Calibri"/>
+                <w:rFonts w:ascii="Calibri" w:hAnsi="Calibri" w:eastAsia="Calibri"/>
                 <w:b w:val="0"/>
-                <w:color w:val="265A61"/>
+                <w:color w:val="255E69"/>
                 <w:sz w:val="15"/>
               </w:rPr>
               <w:t>Добавить сбору категории плательщиков, порог старта, решение-основание и правило закрытия остатка. Редкие параметры спрятать в раскрывающийся блок «Дополнительные условия».</w:t>
@@ -1853,9 +1853,9 @@
             </w:pPr>
             <w:r>
               <w:rPr>
-                <w:rFonts w:ascii="Calibri" w:hAnsi="Calibri"/>
+                <w:rFonts w:ascii="Calibri" w:hAnsi="Calibri" w:eastAsia="Calibri"/>
                 <w:b/>
-                <w:color w:val="2E74B5"/>
+                <w:color w:val="0070C0"/>
                 <w:sz w:val="15"/>
               </w:rPr>
               <w:t>FIN-06. Расход, документ и лимит полномочий</w:t>
@@ -1880,9 +1880,9 @@
             </w:pPr>
             <w:r>
               <w:rPr>
-                <w:rFonts w:ascii="Calibri" w:hAnsi="Calibri"/>
+                <w:rFonts w:ascii="Calibri" w:hAnsi="Calibri" w:eastAsia="Calibri"/>
                 <w:b w:val="0"/>
-                <w:color w:val="243447"/>
+                <w:color w:val="24364B"/>
                 <w:sz w:val="15"/>
               </w:rPr>
               <w:t>Расход содержит сумму, категорию, получателя и связь с проектом; к нему можно прикрепить документ, сумма проекта увеличивается атомарно. Нет согласования, лимитов роли, состояний «обязательство/оплата/акт» и контроля превышения бюджета.</w:t>
@@ -1908,9 +1908,9 @@
             </w:pPr>
             <w:r>
               <w:rPr>
-                <w:rFonts w:ascii="Calibri" w:hAnsi="Calibri"/>
+                <w:rFonts w:ascii="Calibri" w:hAnsi="Calibri" w:eastAsia="Calibri"/>
                 <w:b/>
-                <w:color w:val="7A5A00"/>
+                <w:color w:val="7F6000"/>
                 <w:sz w:val="15"/>
               </w:rPr>
               <w:t>Частично</w:t>
@@ -1935,9 +1935,9 @@
             </w:pPr>
             <w:r>
               <w:rPr>
-                <w:rFonts w:ascii="Calibri" w:hAnsi="Calibri"/>
+                <w:rFonts w:ascii="Calibri" w:hAnsi="Calibri" w:eastAsia="Calibri"/>
                 <w:b w:val="0"/>
-                <w:color w:val="265A61"/>
+                <w:color w:val="255E69"/>
                 <w:sz w:val="15"/>
               </w:rPr>
               <w:t>Ввести состояния расхода и правила согласования по сумме и роли. Использовать текущую карточку расхода, существующие документы и компактную ленту согласований.</w:t>
@@ -1967,9 +1967,9 @@
             </w:pPr>
             <w:r>
               <w:rPr>
-                <w:rFonts w:ascii="Calibri" w:hAnsi="Calibri"/>
+                <w:rFonts w:ascii="Calibri" w:hAnsi="Calibri" w:eastAsia="Calibri"/>
                 <w:b/>
-                <w:color w:val="2E74B5"/>
+                <w:color w:val="0070C0"/>
                 <w:sz w:val="15"/>
               </w:rPr>
               <w:t>FIN-07. Закрытие месяца и ревизия</w:t>
@@ -1994,9 +1994,9 @@
             </w:pPr>
             <w:r>
               <w:rPr>
-                <w:rFonts w:ascii="Calibri" w:hAnsi="Calibri"/>
+                <w:rFonts w:ascii="Calibri" w:hAnsi="Calibri" w:eastAsia="Calibri"/>
                 <w:b w:val="0"/>
-                <w:color w:val="243447"/>
+                <w:color w:val="24364B"/>
                 <w:sz w:val="15"/>
               </w:rPr>
               <w:t>Есть финансовая сводка, управленческие отчеты и журнал изменений. Нет банковской сверки, закрытия и блокировки периода, начального остатка, корректирующих проводок и отдельного доступа ревизора.</w:t>
@@ -2022,9 +2022,9 @@
             </w:pPr>
             <w:r>
               <w:rPr>
-                <w:rFonts w:ascii="Calibri" w:hAnsi="Calibri"/>
+                <w:rFonts w:ascii="Calibri" w:hAnsi="Calibri" w:eastAsia="Calibri"/>
                 <w:b/>
-                <w:color w:val="7A5A00"/>
+                <w:color w:val="7F6000"/>
                 <w:sz w:val="15"/>
               </w:rPr>
               <w:t>Частично</w:t>
@@ -2049,9 +2049,9 @@
             </w:pPr>
             <w:r>
               <w:rPr>
-                <w:rFonts w:ascii="Calibri" w:hAnsi="Calibri"/>
+                <w:rFonts w:ascii="Calibri" w:hAnsi="Calibri" w:eastAsia="Calibri"/>
                 <w:b w:val="0"/>
-                <w:color w:val="265A61"/>
+                <w:color w:val="255E69"/>
                 <w:sz w:val="15"/>
               </w:rPr>
               <w:t>Добавить финансовый период со статусом «открыт/закрыт», контрольным списком и доступом ревизора только для чтения. Управление разместить в шапке существующей финансовой сводки.</w:t>
@@ -2081,12 +2081,12 @@
             </w:pPr>
             <w:r>
               <w:rPr>
-                <w:rFonts w:ascii="Calibri" w:hAnsi="Calibri"/>
+                <w:rFonts w:ascii="Calibri" w:hAnsi="Calibri" w:eastAsia="Calibri"/>
                 <w:b/>
-                <w:color w:val="2E74B5"/>
+                <w:color w:val="0070C0"/>
                 <w:sz w:val="15"/>
               </w:rPr>
-              <w:t>PRJ-01. Полный цикл проекта от инициативы до результата</w:t>
+              <w:t>FIN-08. Сбор на мост: обязательства, порог запуска и возврат при недоборе</w:t>
             </w:r>
           </w:p>
         </w:tc>
@@ -2108,12 +2108,12 @@
             </w:pPr>
             <w:r>
               <w:rPr>
-                <w:rFonts w:ascii="Calibri" w:hAnsi="Calibri"/>
+                <w:rFonts w:ascii="Calibri" w:hAnsi="Calibri" w:eastAsia="Calibri"/>
                 <w:b w:val="0"/>
-                <w:color w:val="243447"/>
+                <w:color w:val="24364B"/>
                 <w:sz w:val="15"/>
               </w:rPr>
-              <w:t>Реализованы инициатива, голосование, создание проекта председателем, бюджет, задачи, ответственные, обновления, расходы, документы, подрядчик, фото «до/после» и проверка условий завершения. Нет формальной приемки результата и маршрута согласования изменения сметы.</w:t>
+              <w:t>Целевой сбор хранит цель, взносы и прогресс, но деньги можно принимать без предварительно зафиксированного состава участников. Нет срока набора, неизменяемых долей, запрета расходования до достижения минимальной суммы и автоматического возврата при недоборе. Из-за этого проект может зависнуть после частичного финансирования.</w:t>
             </w:r>
           </w:p>
         </w:tc>
@@ -2136,9 +2136,9 @@
             </w:pPr>
             <w:r>
               <w:rPr>
-                <w:rFonts w:ascii="Calibri" w:hAnsi="Calibri"/>
+                <w:rFonts w:ascii="Calibri" w:hAnsi="Calibri" w:eastAsia="Calibri"/>
                 <w:b/>
-                <w:color w:val="7A5A00"/>
+                <w:color w:val="7F6000"/>
                 <w:sz w:val="15"/>
               </w:rPr>
               <w:t>Частично</w:t>
@@ -2163,12 +2163,12 @@
             </w:pPr>
             <w:r>
               <w:rPr>
-                <w:rFonts w:ascii="Calibri" w:hAnsi="Calibri"/>
+                <w:rFonts w:ascii="Calibri" w:hAnsi="Calibri" w:eastAsia="Calibri"/>
                 <w:b w:val="0"/>
-                <w:color w:val="265A61"/>
+                <w:color w:val="255E69"/>
                 <w:sz w:val="15"/>
               </w:rPr>
-              <w:t>Добавить два действия в жизненный цикл проекта: «Запросить изменение сметы» и «Принять результат». Они используют существующие задачи, файлы, комментарий и аудит.</w:t>
+              <w:t>В той же карточке сбора ввести этапы «Набор обязательств → Сбор средств → Исполнение». Сначала фиксировать решение-основание или подписанные соглашения, смету с резервом, срок, участников и их доли; начисления открывать только когда обязательства покрывают минимальный бюджет. Поступления держать на обособленном балансе и не разрешать расходы до 100% порога. При недоборе закрывать сбор и формировать реестр возвратов на исходные реквизиты; зачет в аванс или другой сбор разрешать только по явному выбору плательщика.</w:t>
             </w:r>
           </w:p>
         </w:tc>
@@ -2356,9 +2356,123 @@
             </w:pPr>
             <w:r>
               <w:rPr>
-                <w:rFonts w:ascii="Calibri" w:hAnsi="Calibri"/>
+                <w:rFonts w:ascii="Calibri" w:hAnsi="Calibri" w:eastAsia="Calibri"/>
                 <w:b/>
-                <w:color w:val="2E74B5"/>
+                <w:color w:val="0070C0"/>
+                <w:sz w:val="15"/>
+              </w:rPr>
+              <w:t>PRJ-01. Полный цикл проекта от инициативы до результата</w:t>
+            </w:r>
+          </w:p>
+        </w:tc>
+        <w:tc>
+          <w:tcPr>
+            <w:tcW w:type="dxa" w:w="4200"/>
+            <w:vAlign w:val="center"/>
+            <w:tcMar>
+              <w:top w:w="70" w:type="dxa"/>
+              <w:bottom w:w="70" w:type="dxa"/>
+              <w:start w:w="100" w:type="dxa"/>
+              <w:end w:w="100" w:type="dxa"/>
+            </w:tcMar>
+          </w:tcPr>
+          <w:p>
+            <w:pPr>
+              <w:spacing w:before="0" w:after="0" w:line="240" w:lineRule="auto"/>
+              <w:jc w:val="left"/>
+            </w:pPr>
+            <w:r>
+              <w:rPr>
+                <w:rFonts w:ascii="Calibri" w:hAnsi="Calibri" w:eastAsia="Calibri"/>
+                <w:b w:val="0"/>
+                <w:color w:val="24364B"/>
+                <w:sz w:val="15"/>
+              </w:rPr>
+              <w:t>Реализованы инициатива, голосование, создание проекта председателем, бюджет, задачи, ответственные, обновления, расходы, документы, подрядчик, фото «до/после» и проверка условий завершения. Нет формальной приемки результата и маршрута согласования изменения сметы.</w:t>
+            </w:r>
+          </w:p>
+        </w:tc>
+        <w:tc>
+          <w:tcPr>
+            <w:tcW w:type="dxa" w:w="1400"/>
+            <w:vAlign w:val="center"/>
+            <w:tcMar>
+              <w:top w:w="70" w:type="dxa"/>
+              <w:bottom w:w="70" w:type="dxa"/>
+              <w:start w:w="100" w:type="dxa"/>
+              <w:end w:w="100" w:type="dxa"/>
+            </w:tcMar>
+            <w:shd w:fill="FFF2CC"/>
+          </w:tcPr>
+          <w:p>
+            <w:pPr>
+              <w:spacing w:before="0" w:after="0" w:line="240" w:lineRule="auto"/>
+              <w:jc w:val="center"/>
+            </w:pPr>
+            <w:r>
+              <w:rPr>
+                <w:rFonts w:ascii="Calibri" w:hAnsi="Calibri" w:eastAsia="Calibri"/>
+                <w:b/>
+                <w:color w:val="7F6000"/>
+                <w:sz w:val="15"/>
+              </w:rPr>
+              <w:t>Частично</w:t>
+            </w:r>
+          </w:p>
+        </w:tc>
+        <w:tc>
+          <w:tcPr>
+            <w:tcW w:type="dxa" w:w="5936"/>
+            <w:vAlign w:val="center"/>
+            <w:tcMar>
+              <w:top w:w="70" w:type="dxa"/>
+              <w:bottom w:w="70" w:type="dxa"/>
+              <w:start w:w="100" w:type="dxa"/>
+              <w:end w:w="100" w:type="dxa"/>
+            </w:tcMar>
+          </w:tcPr>
+          <w:p>
+            <w:pPr>
+              <w:spacing w:before="0" w:after="0" w:line="240" w:lineRule="auto"/>
+              <w:jc w:val="left"/>
+            </w:pPr>
+            <w:r>
+              <w:rPr>
+                <w:rFonts w:ascii="Calibri" w:hAnsi="Calibri" w:eastAsia="Calibri"/>
+                <w:b w:val="0"/>
+                <w:color w:val="255E69"/>
+                <w:sz w:val="15"/>
+              </w:rPr>
+              <w:t>Добавить два действия в жизненный цикл проекта: «Запросить изменение сметы» и «Принять результат». Они используют существующие задачи, файлы, комментарий и аудит.</w:t>
+            </w:r>
+          </w:p>
+        </w:tc>
+      </w:tr>
+      <w:tr>
+        <w:trPr>
+          <w:cantSplit/>
+        </w:trPr>
+        <w:tc>
+          <w:tcPr>
+            <w:tcW w:type="dxa" w:w="2600"/>
+            <w:vAlign w:val="center"/>
+            <w:tcMar>
+              <w:top w:w="70" w:type="dxa"/>
+              <w:bottom w:w="70" w:type="dxa"/>
+              <w:start w:w="100" w:type="dxa"/>
+              <w:end w:w="100" w:type="dxa"/>
+            </w:tcMar>
+          </w:tcPr>
+          <w:p>
+            <w:pPr>
+              <w:spacing w:before="0" w:after="0" w:line="240" w:lineRule="auto"/>
+              <w:jc w:val="left"/>
+            </w:pPr>
+            <w:r>
+              <w:rPr>
+                <w:rFonts w:ascii="Calibri" w:hAnsi="Calibri" w:eastAsia="Calibri"/>
+                <w:b/>
+                <w:color w:val="0070C0"/>
                 <w:sz w:val="15"/>
               </w:rPr>
               <w:t>PRJ-02. Выбор подрядчика и конфликт интересов</w:t>
@@ -2383,9 +2497,9 @@
             </w:pPr>
             <w:r>
               <w:rPr>
-                <w:rFonts w:ascii="Calibri" w:hAnsi="Calibri"/>
+                <w:rFonts w:ascii="Calibri" w:hAnsi="Calibri" w:eastAsia="Calibri"/>
                 <w:b w:val="0"/>
-                <w:color w:val="243447"/>
+                <w:color w:val="24364B"/>
                 <w:sz w:val="15"/>
               </w:rPr>
               <w:t>Есть реестр подрядчиков, рейтинг, договорная стоимость и привязка к проекту. Нет хранения нескольких предложений, сравнительной таблицы, критериев выбора, декларации конфликта интересов и отвода участника.</w:t>
@@ -2411,9 +2525,9 @@
             </w:pPr>
             <w:r>
               <w:rPr>
-                <w:rFonts w:ascii="Calibri" w:hAnsi="Calibri"/>
+                <w:rFonts w:ascii="Calibri" w:hAnsi="Calibri" w:eastAsia="Calibri"/>
                 <w:b/>
-                <w:color w:val="9B1C1C"/>
+                <w:color w:val="A61C1C"/>
                 <w:sz w:val="15"/>
               </w:rPr>
               <w:t>Нет</w:t>
@@ -2438,9 +2552,9 @@
             </w:pPr>
             <w:r>
               <w:rPr>
-                <w:rFonts w:ascii="Calibri" w:hAnsi="Calibri"/>
+                <w:rFonts w:ascii="Calibri" w:hAnsi="Calibri" w:eastAsia="Calibri"/>
                 <w:b w:val="0"/>
-                <w:color w:val="265A61"/>
+                <w:color w:val="255E69"/>
                 <w:sz w:val="15"/>
               </w:rPr>
               <w:t>Хранить предложения подрядчиков внутри проекта и показывать боковую панель сравнения. Декларацию конфликта и отвод включить в действие выбора подрядчика.</w:t>
@@ -2470,9 +2584,9 @@
             </w:pPr>
             <w:r>
               <w:rPr>
-                <w:rFonts w:ascii="Calibri" w:hAnsi="Calibri"/>
+                <w:rFonts w:ascii="Calibri" w:hAnsi="Calibri" w:eastAsia="Calibri"/>
                 <w:b/>
-                <w:color w:val="2E74B5"/>
+                <w:color w:val="0070C0"/>
                 <w:sz w:val="15"/>
               </w:rPr>
               <w:t>PRJ-03. Гарантийная претензия</w:t>
@@ -2497,9 +2611,9 @@
             </w:pPr>
             <w:r>
               <w:rPr>
-                <w:rFonts w:ascii="Calibri" w:hAnsi="Calibri"/>
+                <w:rFonts w:ascii="Calibri" w:hAnsi="Calibri" w:eastAsia="Calibri"/>
                 <w:b w:val="0"/>
-                <w:color w:val="243447"/>
+                <w:color w:val="24364B"/>
                 <w:sz w:val="15"/>
               </w:rPr>
               <w:t>В связи проекта с подрядчиком хранится дата окончания гарантии, а обращения имеют историю и фото. Обращение нельзя связать с проектом, подрядчиком, договором или гарантийным обязательством; претензионный процесс отсутствует.</w:t>
@@ -2525,9 +2639,9 @@
             </w:pPr>
             <w:r>
               <w:rPr>
-                <w:rFonts w:ascii="Calibri" w:hAnsi="Calibri"/>
+                <w:rFonts w:ascii="Calibri" w:hAnsi="Calibri" w:eastAsia="Calibri"/>
                 <w:b/>
-                <w:color w:val="7A5A00"/>
+                <w:color w:val="7F6000"/>
                 <w:sz w:val="15"/>
               </w:rPr>
               <w:t>Частично</w:t>
@@ -2552,9 +2666,9 @@
             </w:pPr>
             <w:r>
               <w:rPr>
-                <w:rFonts w:ascii="Calibri" w:hAnsi="Calibri"/>
+                <w:rFonts w:ascii="Calibri" w:hAnsi="Calibri" w:eastAsia="Calibri"/>
                 <w:b w:val="0"/>
-                <w:color w:val="265A61"/>
+                <w:color w:val="255E69"/>
                 <w:sz w:val="15"/>
               </w:rPr>
               <w:t>Добавить обращению тип «гарантийная претензия» и связи с проектом, подрядчиком и документом. Использовать обычный маршрут обращения и отдельный фильтр в реестре.</w:t>
@@ -2584,9 +2698,9 @@
             </w:pPr>
             <w:r>
               <w:rPr>
-                <w:rFonts w:ascii="Calibri" w:hAnsi="Calibri"/>
+                <w:rFonts w:ascii="Calibri" w:hAnsi="Calibri" w:eastAsia="Calibri"/>
                 <w:b/>
-                <w:color w:val="2E74B5"/>
+                <w:color w:val="0070C0"/>
                 <w:sz w:val="15"/>
               </w:rPr>
               <w:t>PRJ-04. Повторяющиеся сезонные работы</w:t>
@@ -2611,9 +2725,9 @@
             </w:pPr>
             <w:r>
               <w:rPr>
-                <w:rFonts w:ascii="Calibri" w:hAnsi="Calibri"/>
+                <w:rFonts w:ascii="Calibri" w:hAnsi="Calibri" w:eastAsia="Calibri"/>
                 <w:b w:val="0"/>
-                <w:color w:val="243447"/>
+                <w:color w:val="24364B"/>
                 <w:sz w:val="15"/>
               </w:rPr>
               <w:t>Можно создавать обычные проекты и задачи со сроками. Нет периодичности, шаблонов сезонных работ, зон обслуживания, автоматического создания повторений и контроля пропуска.</w:t>
@@ -2639,9 +2753,9 @@
             </w:pPr>
             <w:r>
               <w:rPr>
-                <w:rFonts w:ascii="Calibri" w:hAnsi="Calibri"/>
+                <w:rFonts w:ascii="Calibri" w:hAnsi="Calibri" w:eastAsia="Calibri"/>
                 <w:b/>
-                <w:color w:val="9B1C1C"/>
+                <w:color w:val="A61C1C"/>
                 <w:sz w:val="15"/>
               </w:rPr>
               <w:t>Нет</w:t>
@@ -2666,9 +2780,9 @@
             </w:pPr>
             <w:r>
               <w:rPr>
-                <w:rFonts w:ascii="Calibri" w:hAnsi="Calibri"/>
+                <w:rFonts w:ascii="Calibri" w:hAnsi="Calibri" w:eastAsia="Calibri"/>
                 <w:b w:val="0"/>
-                <w:color w:val="265A61"/>
+                <w:color w:val="255E69"/>
                 <w:sz w:val="15"/>
               </w:rPr>
               <w:t>Создать шаблон повторяющейся работы с сезоном, зоной и периодичностью, который генерирует обычные задачи или проекты. Настройку разместить в диалоге шаблонов проектов.</w:t>
@@ -2698,12 +2812,12 @@
             </w:pPr>
             <w:r>
               <w:rPr>
-                <w:rFonts w:ascii="Calibri" w:hAnsi="Calibri"/>
+                <w:rFonts w:ascii="Calibri" w:hAnsi="Calibri" w:eastAsia="Calibri"/>
                 <w:b/>
-                <w:color w:val="2E74B5"/>
+                <w:color w:val="0070C0"/>
                 <w:sz w:val="15"/>
               </w:rPr>
-              <w:t>OPS-01. Ночная авария и массовое оповещение</w:t>
+              <w:t>PRJ-05. Отмена уже запущенного проекта и расчет с участниками</w:t>
             </w:r>
           </w:p>
         </w:tc>
@@ -2725,12 +2839,12 @@
             </w:pPr>
             <w:r>
               <w:rPr>
-                <w:rFonts w:ascii="Calibri" w:hAnsi="Calibri"/>
+                <w:rFonts w:ascii="Calibri" w:hAnsi="Calibri" w:eastAsia="Calibri"/>
                 <w:b w:val="0"/>
-                <w:color w:val="243447"/>
+                <w:color w:val="24364B"/>
                 <w:sz w:val="15"/>
               </w:rPr>
-              <w:t>Есть обращения, аварийные объявления, уведомления в приложении и email. Нет типа аварийного инцидента, объединения сообщений, зоны поражения, дежурства, эскалации, времени следующего обновления и разбора причин.</w:t>
+              <w:t>Проект можно завершить после выполнения задач, но нет контролируемой отмены после начала работ, остановки обязательств перед подрядчиком, фиксации фактически принятого результата и распределения оставшихся либо недостающих средств.</w:t>
             </w:r>
           </w:p>
         </w:tc>
@@ -2744,7 +2858,7 @@
               <w:start w:w="100" w:type="dxa"/>
               <w:end w:w="100" w:type="dxa"/>
             </w:tcMar>
-            <w:shd w:fill="FFF2CC"/>
+            <w:shd w:fill="FCE4E4"/>
           </w:tcPr>
           <w:p>
             <w:pPr>
@@ -2753,12 +2867,12 @@
             </w:pPr>
             <w:r>
               <w:rPr>
-                <w:rFonts w:ascii="Calibri" w:hAnsi="Calibri"/>
+                <w:rFonts w:ascii="Calibri" w:hAnsi="Calibri" w:eastAsia="Calibri"/>
                 <w:b/>
-                <w:color w:val="7A5A00"/>
+                <w:color w:val="A61C1C"/>
                 <w:sz w:val="15"/>
               </w:rPr>
-              <w:t>Частично</w:t>
+              <w:t>Нет</w:t>
             </w:r>
           </w:p>
         </w:tc>
@@ -2780,126 +2894,12 @@
             </w:pPr>
             <w:r>
               <w:rPr>
-                <w:rFonts w:ascii="Calibri" w:hAnsi="Calibri"/>
+                <w:rFonts w:ascii="Calibri" w:hAnsi="Calibri" w:eastAsia="Calibri"/>
                 <w:b w:val="0"/>
-                <w:color w:val="265A61"/>
+                <w:color w:val="255E69"/>
                 <w:sz w:val="15"/>
               </w:rPr>
-              <w:t>Добавить обращению аварийный режим: затронутые улицы, дежурный, эскалация и время следующего сообщения. Обновления автоматически публиковать через существующие уведомления.</w:t>
-            </w:r>
-          </w:p>
-        </w:tc>
-      </w:tr>
-      <w:tr>
-        <w:trPr>
-          <w:cantSplit/>
-        </w:trPr>
-        <w:tc>
-          <w:tcPr>
-            <w:tcW w:type="dxa" w:w="2600"/>
-            <w:vAlign w:val="center"/>
-            <w:tcMar>
-              <w:top w:w="70" w:type="dxa"/>
-              <w:bottom w:w="70" w:type="dxa"/>
-              <w:start w:w="100" w:type="dxa"/>
-              <w:end w:w="100" w:type="dxa"/>
-            </w:tcMar>
-          </w:tcPr>
-          <w:p>
-            <w:pPr>
-              <w:spacing w:before="0" w:after="0" w:line="240" w:lineRule="auto"/>
-              <w:jc w:val="left"/>
-            </w:pPr>
-            <w:r>
-              <w:rPr>
-                <w:rFonts w:ascii="Calibri" w:hAnsi="Calibri"/>
-                <w:b/>
-                <w:color w:val="2E74B5"/>
-                <w:sz w:val="15"/>
-              </w:rPr>
-              <w:t>OPS-02. Обращение, срок, дубли и повторное открытие</w:t>
-            </w:r>
-          </w:p>
-        </w:tc>
-        <w:tc>
-          <w:tcPr>
-            <w:tcW w:type="dxa" w:w="4200"/>
-            <w:vAlign w:val="center"/>
-            <w:tcMar>
-              <w:top w:w="70" w:type="dxa"/>
-              <w:bottom w:w="70" w:type="dxa"/>
-              <w:start w:w="100" w:type="dxa"/>
-              <w:end w:w="100" w:type="dxa"/>
-            </w:tcMar>
-          </w:tcPr>
-          <w:p>
-            <w:pPr>
-              <w:spacing w:before="0" w:after="0" w:line="240" w:lineRule="auto"/>
-              <w:jc w:val="left"/>
-            </w:pPr>
-            <w:r>
-              <w:rPr>
-                <w:rFonts w:ascii="Calibri" w:hAnsi="Calibri"/>
-                <w:b w:val="0"/>
-                <w:color w:val="243447"/>
-                <w:sz w:val="15"/>
-              </w:rPr>
-              <w:t>Реализованы номер, адрес, координаты, ответственный, срок, статусы, история и обязательное подтверждение результата. Нет объединения дублей, комментариев заявителя к результату и перехода из закрытого состояния обратно в работу.</w:t>
-            </w:r>
-          </w:p>
-        </w:tc>
-        <w:tc>
-          <w:tcPr>
-            <w:tcW w:type="dxa" w:w="1400"/>
-            <w:vAlign w:val="center"/>
-            <w:tcMar>
-              <w:top w:w="70" w:type="dxa"/>
-              <w:bottom w:w="70" w:type="dxa"/>
-              <w:start w:w="100" w:type="dxa"/>
-              <w:end w:w="100" w:type="dxa"/>
-            </w:tcMar>
-            <w:shd w:fill="FFF2CC"/>
-          </w:tcPr>
-          <w:p>
-            <w:pPr>
-              <w:spacing w:before="0" w:after="0" w:line="240" w:lineRule="auto"/>
-              <w:jc w:val="center"/>
-            </w:pPr>
-            <w:r>
-              <w:rPr>
-                <w:rFonts w:ascii="Calibri" w:hAnsi="Calibri"/>
-                <w:b/>
-                <w:color w:val="7A5A00"/>
-                <w:sz w:val="15"/>
-              </w:rPr>
-              <w:t>Частично</w:t>
-            </w:r>
-          </w:p>
-        </w:tc>
-        <w:tc>
-          <w:tcPr>
-            <w:tcW w:type="dxa" w:w="5936"/>
-            <w:vAlign w:val="center"/>
-            <w:tcMar>
-              <w:top w:w="70" w:type="dxa"/>
-              <w:bottom w:w="70" w:type="dxa"/>
-              <w:start w:w="100" w:type="dxa"/>
-              <w:end w:w="100" w:type="dxa"/>
-            </w:tcMar>
-          </w:tcPr>
-          <w:p>
-            <w:pPr>
-              <w:spacing w:before="0" w:after="0" w:line="240" w:lineRule="auto"/>
-              <w:jc w:val="left"/>
-            </w:pPr>
-            <w:r>
-              <w:rPr>
-                <w:rFonts w:ascii="Calibri" w:hAnsi="Calibri"/>
-                <w:b w:val="0"/>
-                <w:color w:val="265A61"/>
-                <w:sz w:val="15"/>
-              </w:rPr>
-              <w:t>Добавить подсказку о похожих обращениях, действия «Объединить» и «Открыть повторно», а также комментарий заявителя. Все действия оставить в карточке обращения.</w:t>
+              <w:t>Добавить в меню проекта одно действие «Отменить или пересмотреть». Оно требует нового решения, замораживает новые расходы, фиксирует выполненные работы и неизбежные обязательства, рассчитывает свободный остаток и формирует пропорциональные возвраты. Если остатка не хватает для закрытия обязательств, дополнительное начисление возможно только по отдельно утвержденному основанию; весь расчет сохранять в аудите проекта.</w:t>
             </w:r>
           </w:p>
         </w:tc>
@@ -3087,9 +3087,237 @@
             </w:pPr>
             <w:r>
               <w:rPr>
-                <w:rFonts w:ascii="Calibri" w:hAnsi="Calibri"/>
+                <w:rFonts w:ascii="Calibri" w:hAnsi="Calibri" w:eastAsia="Calibri"/>
                 <w:b/>
-                <w:color w:val="2E74B5"/>
+                <w:color w:val="0070C0"/>
+                <w:sz w:val="15"/>
+              </w:rPr>
+              <w:t>OPS-01. Ночная авария и массовое оповещение</w:t>
+            </w:r>
+          </w:p>
+        </w:tc>
+        <w:tc>
+          <w:tcPr>
+            <w:tcW w:type="dxa" w:w="4200"/>
+            <w:vAlign w:val="center"/>
+            <w:tcMar>
+              <w:top w:w="70" w:type="dxa"/>
+              <w:bottom w:w="70" w:type="dxa"/>
+              <w:start w:w="100" w:type="dxa"/>
+              <w:end w:w="100" w:type="dxa"/>
+            </w:tcMar>
+          </w:tcPr>
+          <w:p>
+            <w:pPr>
+              <w:spacing w:before="0" w:after="0" w:line="240" w:lineRule="auto"/>
+              <w:jc w:val="left"/>
+            </w:pPr>
+            <w:r>
+              <w:rPr>
+                <w:rFonts w:ascii="Calibri" w:hAnsi="Calibri" w:eastAsia="Calibri"/>
+                <w:b w:val="0"/>
+                <w:color w:val="24364B"/>
+                <w:sz w:val="15"/>
+              </w:rPr>
+              <w:t>Есть обращения, аварийные объявления, уведомления в приложении и email. Нет типа аварийного инцидента, объединения сообщений, зоны поражения, дежурства, эскалации, времени следующего обновления и разбора причин.</w:t>
+            </w:r>
+          </w:p>
+        </w:tc>
+        <w:tc>
+          <w:tcPr>
+            <w:tcW w:type="dxa" w:w="1400"/>
+            <w:vAlign w:val="center"/>
+            <w:tcMar>
+              <w:top w:w="70" w:type="dxa"/>
+              <w:bottom w:w="70" w:type="dxa"/>
+              <w:start w:w="100" w:type="dxa"/>
+              <w:end w:w="100" w:type="dxa"/>
+            </w:tcMar>
+            <w:shd w:fill="FFF2CC"/>
+          </w:tcPr>
+          <w:p>
+            <w:pPr>
+              <w:spacing w:before="0" w:after="0" w:line="240" w:lineRule="auto"/>
+              <w:jc w:val="center"/>
+            </w:pPr>
+            <w:r>
+              <w:rPr>
+                <w:rFonts w:ascii="Calibri" w:hAnsi="Calibri" w:eastAsia="Calibri"/>
+                <w:b/>
+                <w:color w:val="7F6000"/>
+                <w:sz w:val="15"/>
+              </w:rPr>
+              <w:t>Частично</w:t>
+            </w:r>
+          </w:p>
+        </w:tc>
+        <w:tc>
+          <w:tcPr>
+            <w:tcW w:type="dxa" w:w="5936"/>
+            <w:vAlign w:val="center"/>
+            <w:tcMar>
+              <w:top w:w="70" w:type="dxa"/>
+              <w:bottom w:w="70" w:type="dxa"/>
+              <w:start w:w="100" w:type="dxa"/>
+              <w:end w:w="100" w:type="dxa"/>
+            </w:tcMar>
+          </w:tcPr>
+          <w:p>
+            <w:pPr>
+              <w:spacing w:before="0" w:after="0" w:line="240" w:lineRule="auto"/>
+              <w:jc w:val="left"/>
+            </w:pPr>
+            <w:r>
+              <w:rPr>
+                <w:rFonts w:ascii="Calibri" w:hAnsi="Calibri" w:eastAsia="Calibri"/>
+                <w:b w:val="0"/>
+                <w:color w:val="255E69"/>
+                <w:sz w:val="15"/>
+              </w:rPr>
+              <w:t>Добавить обращению аварийный режим: затронутые улицы, дежурный, эскалация и время следующего сообщения. Обновления автоматически публиковать через существующие уведомления.</w:t>
+            </w:r>
+          </w:p>
+        </w:tc>
+      </w:tr>
+      <w:tr>
+        <w:trPr>
+          <w:cantSplit/>
+        </w:trPr>
+        <w:tc>
+          <w:tcPr>
+            <w:tcW w:type="dxa" w:w="2600"/>
+            <w:vAlign w:val="center"/>
+            <w:tcMar>
+              <w:top w:w="70" w:type="dxa"/>
+              <w:bottom w:w="70" w:type="dxa"/>
+              <w:start w:w="100" w:type="dxa"/>
+              <w:end w:w="100" w:type="dxa"/>
+            </w:tcMar>
+          </w:tcPr>
+          <w:p>
+            <w:pPr>
+              <w:spacing w:before="0" w:after="0" w:line="240" w:lineRule="auto"/>
+              <w:jc w:val="left"/>
+            </w:pPr>
+            <w:r>
+              <w:rPr>
+                <w:rFonts w:ascii="Calibri" w:hAnsi="Calibri" w:eastAsia="Calibri"/>
+                <w:b/>
+                <w:color w:val="0070C0"/>
+                <w:sz w:val="15"/>
+              </w:rPr>
+              <w:t>OPS-02. Обращение, срок, дубли и повторное открытие</w:t>
+            </w:r>
+          </w:p>
+        </w:tc>
+        <w:tc>
+          <w:tcPr>
+            <w:tcW w:type="dxa" w:w="4200"/>
+            <w:vAlign w:val="center"/>
+            <w:tcMar>
+              <w:top w:w="70" w:type="dxa"/>
+              <w:bottom w:w="70" w:type="dxa"/>
+              <w:start w:w="100" w:type="dxa"/>
+              <w:end w:w="100" w:type="dxa"/>
+            </w:tcMar>
+          </w:tcPr>
+          <w:p>
+            <w:pPr>
+              <w:spacing w:before="0" w:after="0" w:line="240" w:lineRule="auto"/>
+              <w:jc w:val="left"/>
+            </w:pPr>
+            <w:r>
+              <w:rPr>
+                <w:rFonts w:ascii="Calibri" w:hAnsi="Calibri" w:eastAsia="Calibri"/>
+                <w:b w:val="0"/>
+                <w:color w:val="24364B"/>
+                <w:sz w:val="15"/>
+              </w:rPr>
+              <w:t>Реализованы номер, адрес, координаты, ответственный, срок, статусы, история и обязательное подтверждение результата. Нет объединения дублей, комментариев заявителя к результату и перехода из закрытого состояния обратно в работу.</w:t>
+            </w:r>
+          </w:p>
+        </w:tc>
+        <w:tc>
+          <w:tcPr>
+            <w:tcW w:type="dxa" w:w="1400"/>
+            <w:vAlign w:val="center"/>
+            <w:tcMar>
+              <w:top w:w="70" w:type="dxa"/>
+              <w:bottom w:w="70" w:type="dxa"/>
+              <w:start w:w="100" w:type="dxa"/>
+              <w:end w:w="100" w:type="dxa"/>
+            </w:tcMar>
+            <w:shd w:fill="FFF2CC"/>
+          </w:tcPr>
+          <w:p>
+            <w:pPr>
+              <w:spacing w:before="0" w:after="0" w:line="240" w:lineRule="auto"/>
+              <w:jc w:val="center"/>
+            </w:pPr>
+            <w:r>
+              <w:rPr>
+                <w:rFonts w:ascii="Calibri" w:hAnsi="Calibri" w:eastAsia="Calibri"/>
+                <w:b/>
+                <w:color w:val="7F6000"/>
+                <w:sz w:val="15"/>
+              </w:rPr>
+              <w:t>Частично</w:t>
+            </w:r>
+          </w:p>
+        </w:tc>
+        <w:tc>
+          <w:tcPr>
+            <w:tcW w:type="dxa" w:w="5936"/>
+            <w:vAlign w:val="center"/>
+            <w:tcMar>
+              <w:top w:w="70" w:type="dxa"/>
+              <w:bottom w:w="70" w:type="dxa"/>
+              <w:start w:w="100" w:type="dxa"/>
+              <w:end w:w="100" w:type="dxa"/>
+            </w:tcMar>
+          </w:tcPr>
+          <w:p>
+            <w:pPr>
+              <w:spacing w:before="0" w:after="0" w:line="240" w:lineRule="auto"/>
+              <w:jc w:val="left"/>
+            </w:pPr>
+            <w:r>
+              <w:rPr>
+                <w:rFonts w:ascii="Calibri" w:hAnsi="Calibri" w:eastAsia="Calibri"/>
+                <w:b w:val="0"/>
+                <w:color w:val="255E69"/>
+                <w:sz w:val="15"/>
+              </w:rPr>
+              <w:t>Добавить подсказку о похожих обращениях, действия «Объединить» и «Открыть повторно», а также комментарий заявителя. Все действия оставить в карточке обращения.</w:t>
+            </w:r>
+          </w:p>
+        </w:tc>
+      </w:tr>
+      <w:tr>
+        <w:trPr>
+          <w:cantSplit/>
+        </w:trPr>
+        <w:tc>
+          <w:tcPr>
+            <w:tcW w:type="dxa" w:w="2600"/>
+            <w:vAlign w:val="center"/>
+            <w:tcMar>
+              <w:top w:w="70" w:type="dxa"/>
+              <w:bottom w:w="70" w:type="dxa"/>
+              <w:start w:w="100" w:type="dxa"/>
+              <w:end w:w="100" w:type="dxa"/>
+            </w:tcMar>
+          </w:tcPr>
+          <w:p>
+            <w:pPr>
+              <w:spacing w:before="0" w:after="0" w:line="240" w:lineRule="auto"/>
+              <w:jc w:val="left"/>
+            </w:pPr>
+            <w:r>
+              <w:rPr>
+                <w:rFonts w:ascii="Calibri" w:hAnsi="Calibri" w:eastAsia="Calibri"/>
+                <w:b/>
+                <w:color w:val="0070C0"/>
                 <w:sz w:val="15"/>
               </w:rPr>
               <w:t>OPS-03. Плановое отключение и адресное предупреждение</w:t>
@@ -3114,9 +3342,9 @@
             </w:pPr>
             <w:r>
               <w:rPr>
-                <w:rFonts w:ascii="Calibri" w:hAnsi="Calibri"/>
+                <w:rFonts w:ascii="Calibri" w:hAnsi="Calibri" w:eastAsia="Calibri"/>
                 <w:b w:val="0"/>
-                <w:color w:val="243447"/>
+                <w:color w:val="24364B"/>
                 <w:sz w:val="15"/>
               </w:rPr>
               <w:t>Можно опубликовать объявление со сроком и отправить уведомление всем участникам. Нет выбора улиц или участков, учета уязвимых жителей, подтверждения прочтения критического сообщения и связанного плана подготовительных задач.</w:t>
@@ -3142,9 +3370,9 @@
             </w:pPr>
             <w:r>
               <w:rPr>
-                <w:rFonts w:ascii="Calibri" w:hAnsi="Calibri"/>
+                <w:rFonts w:ascii="Calibri" w:hAnsi="Calibri" w:eastAsia="Calibri"/>
                 <w:b/>
-                <w:color w:val="7A5A00"/>
+                <w:color w:val="7F6000"/>
                 <w:sz w:val="15"/>
               </w:rPr>
               <w:t>Частично</w:t>
@@ -3169,9 +3397,9 @@
             </w:pPr>
             <w:r>
               <w:rPr>
-                <w:rFonts w:ascii="Calibri" w:hAnsi="Calibri"/>
+                <w:rFonts w:ascii="Calibri" w:hAnsi="Calibri" w:eastAsia="Calibri"/>
                 <w:b w:val="0"/>
-                <w:color w:val="265A61"/>
+                <w:color w:val="255E69"/>
                 <w:sz w:val="15"/>
               </w:rPr>
               <w:t>Расширить выбор аудитории объявления улицами, участками и служебной отметкой уязвимости; для критического сообщения включать подтверждение прочтения. Использовать один общий селектор аудитории.</w:t>
@@ -3201,9 +3429,9 @@
             </w:pPr>
             <w:r>
               <w:rPr>
-                <w:rFonts w:ascii="Calibri" w:hAnsi="Calibri"/>
+                <w:rFonts w:ascii="Calibri" w:hAnsi="Calibri" w:eastAsia="Calibri"/>
                 <w:b/>
-                <w:color w:val="2E74B5"/>
+                <w:color w:val="0070C0"/>
                 <w:sz w:val="15"/>
               </w:rPr>
               <w:t>OPS-04. Вывоз мусора, задержка и незаконный сброс</w:t>
@@ -3228,9 +3456,9 @@
             </w:pPr>
             <w:r>
               <w:rPr>
-                <w:rFonts w:ascii="Calibri" w:hAnsi="Calibri"/>
+                <w:rFonts w:ascii="Calibri" w:hAnsi="Calibri" w:eastAsia="Calibri"/>
                 <w:b w:val="0"/>
-                <w:color w:val="243447"/>
+                <w:color w:val="24364B"/>
                 <w:sz w:val="15"/>
               </w:rPr>
               <w:t>Реализованы правила по видам отходов, площадки, график, статусы вывоза, уведомление о задержке и заявка на дополнительный вывоз. Нет претензии к подрядчику, фиксации незаконного сброса как отдельного инцидента и показателей качества услуги.</w:t>
@@ -3256,9 +3484,9 @@
             </w:pPr>
             <w:r>
               <w:rPr>
-                <w:rFonts w:ascii="Calibri" w:hAnsi="Calibri"/>
+                <w:rFonts w:ascii="Calibri" w:hAnsi="Calibri" w:eastAsia="Calibri"/>
                 <w:b/>
-                <w:color w:val="7A5A00"/>
+                <w:color w:val="7F6000"/>
                 <w:sz w:val="15"/>
               </w:rPr>
               <w:t>Частично</w:t>
@@ -3283,9 +3511,9 @@
             </w:pPr>
             <w:r>
               <w:rPr>
-                <w:rFonts w:ascii="Calibri" w:hAnsi="Calibri"/>
+                <w:rFonts w:ascii="Calibri" w:hAnsi="Calibri" w:eastAsia="Calibri"/>
                 <w:b w:val="0"/>
-                <w:color w:val="265A61"/>
+                <w:color w:val="255E69"/>
                 <w:sz w:val="15"/>
               </w:rPr>
               <w:t>Использовать обращение с подтипами «незаконный сброс» и «претензия к вывозу», связанными с площадкой и подрядчиком. Показатели SLA считать автоматически из сроков обращений.</w:t>
@@ -3315,9 +3543,9 @@
             </w:pPr>
             <w:r>
               <w:rPr>
-                <w:rFonts w:ascii="Calibri" w:hAnsi="Calibri"/>
+                <w:rFonts w:ascii="Calibri" w:hAnsi="Calibri" w:eastAsia="Calibri"/>
                 <w:b/>
-                <w:color w:val="2E74B5"/>
+                <w:color w:val="0070C0"/>
                 <w:sz w:val="15"/>
               </w:rPr>
               <w:t>OPS-05. Временные пропуска и аварийный проезд</w:t>
@@ -3342,9 +3570,9 @@
             </w:pPr>
             <w:r>
               <w:rPr>
-                <w:rFonts w:ascii="Calibri" w:hAnsi="Calibri"/>
+                <w:rFonts w:ascii="Calibri" w:hAnsi="Calibri" w:eastAsia="Calibri"/>
                 <w:b w:val="0"/>
-                <w:color w:val="243447"/>
+                <w:color w:val="24364B"/>
                 <w:sz w:val="15"/>
               </w:rPr>
               <w:t>На карте можно отметить ворота или шлагбаум. Реестра автомобилей, временных пропусков, сроков, доступа охраны и аварийного открытия нет.</w:t>
@@ -3370,9 +3598,9 @@
             </w:pPr>
             <w:r>
               <w:rPr>
-                <w:rFonts w:ascii="Calibri" w:hAnsi="Calibri"/>
+                <w:rFonts w:ascii="Calibri" w:hAnsi="Calibri" w:eastAsia="Calibri"/>
                 <w:b/>
-                <w:color w:val="9B1C1C"/>
+                <w:color w:val="A61C1C"/>
                 <w:sz w:val="15"/>
               </w:rPr>
               <w:t>Нет</w:t>
@@ -3397,240 +3625,12 @@
             </w:pPr>
             <w:r>
               <w:rPr>
-                <w:rFonts w:ascii="Calibri" w:hAnsi="Calibri"/>
+                <w:rFonts w:ascii="Calibri" w:hAnsi="Calibri" w:eastAsia="Calibri"/>
                 <w:b w:val="0"/>
-                <w:color w:val="265A61"/>
+                <w:color w:val="255E69"/>
                 <w:sz w:val="15"/>
               </w:rPr>
               <w:t>Добавить к участку автомобили и временные пропуска со сроком, а к точке ворот — право просмотра охраной. Управление разместить в карточке участка и маркере ворот.</w:t>
-            </w:r>
-          </w:p>
-        </w:tc>
-      </w:tr>
-      <w:tr>
-        <w:trPr>
-          <w:cantSplit/>
-        </w:trPr>
-        <w:tc>
-          <w:tcPr>
-            <w:tcW w:type="dxa" w:w="2600"/>
-            <w:vAlign w:val="center"/>
-            <w:tcMar>
-              <w:top w:w="70" w:type="dxa"/>
-              <w:bottom w:w="70" w:type="dxa"/>
-              <w:start w:w="100" w:type="dxa"/>
-              <w:end w:w="100" w:type="dxa"/>
-            </w:tcMar>
-          </w:tcPr>
-          <w:p>
-            <w:pPr>
-              <w:spacing w:before="0" w:after="0" w:line="240" w:lineRule="auto"/>
-              <w:jc w:val="left"/>
-            </w:pPr>
-            <w:r>
-              <w:rPr>
-                <w:rFonts w:ascii="Calibri" w:hAnsi="Calibri"/>
-                <w:b/>
-                <w:color w:val="2E74B5"/>
-                <w:sz w:val="15"/>
-              </w:rPr>
-              <w:t>COM-01. Приоритеты и контроль доставки уведомлений</w:t>
-            </w:r>
-          </w:p>
-        </w:tc>
-        <w:tc>
-          <w:tcPr>
-            <w:tcW w:type="dxa" w:w="4200"/>
-            <w:vAlign w:val="center"/>
-            <w:tcMar>
-              <w:top w:w="70" w:type="dxa"/>
-              <w:bottom w:w="70" w:type="dxa"/>
-              <w:start w:w="100" w:type="dxa"/>
-              <w:end w:w="100" w:type="dxa"/>
-            </w:tcMar>
-          </w:tcPr>
-          <w:p>
-            <w:pPr>
-              <w:spacing w:before="0" w:after="0" w:line="240" w:lineRule="auto"/>
-              <w:jc w:val="left"/>
-            </w:pPr>
-            <w:r>
-              <w:rPr>
-                <w:rFonts w:ascii="Calibri" w:hAnsi="Calibri"/>
-                <w:b w:val="0"/>
-                <w:color w:val="243447"/>
-                <w:sz w:val="15"/>
-              </w:rPr>
-              <w:t>Есть обычный, важный и аварийный приоритет, пользовательские настройки, уведомления в приложении, email-очередь, повторные попытки и реестр ошибок доставки. Нет push/SMS, адресного резервного канала и гарантированной доставки аварии при отключенных пользователем каналах.</w:t>
-            </w:r>
-          </w:p>
-        </w:tc>
-        <w:tc>
-          <w:tcPr>
-            <w:tcW w:type="dxa" w:w="1400"/>
-            <w:vAlign w:val="center"/>
-            <w:tcMar>
-              <w:top w:w="70" w:type="dxa"/>
-              <w:bottom w:w="70" w:type="dxa"/>
-              <w:start w:w="100" w:type="dxa"/>
-              <w:end w:w="100" w:type="dxa"/>
-            </w:tcMar>
-            <w:shd w:fill="FFF2CC"/>
-          </w:tcPr>
-          <w:p>
-            <w:pPr>
-              <w:spacing w:before="0" w:after="0" w:line="240" w:lineRule="auto"/>
-              <w:jc w:val="center"/>
-            </w:pPr>
-            <w:r>
-              <w:rPr>
-                <w:rFonts w:ascii="Calibri" w:hAnsi="Calibri"/>
-                <w:b/>
-                <w:color w:val="7A5A00"/>
-                <w:sz w:val="15"/>
-              </w:rPr>
-              <w:t>Частично</w:t>
-            </w:r>
-          </w:p>
-        </w:tc>
-        <w:tc>
-          <w:tcPr>
-            <w:tcW w:type="dxa" w:w="5936"/>
-            <w:vAlign w:val="center"/>
-            <w:tcMar>
-              <w:top w:w="70" w:type="dxa"/>
-              <w:bottom w:w="70" w:type="dxa"/>
-              <w:start w:w="100" w:type="dxa"/>
-              <w:end w:w="100" w:type="dxa"/>
-            </w:tcMar>
-          </w:tcPr>
-          <w:p>
-            <w:pPr>
-              <w:spacing w:before="0" w:after="0" w:line="240" w:lineRule="auto"/>
-              <w:jc w:val="left"/>
-            </w:pPr>
-            <w:r>
-              <w:rPr>
-                <w:rFonts w:ascii="Calibri" w:hAnsi="Calibri"/>
-                <w:b w:val="0"/>
-                <w:color w:val="265A61"/>
-                <w:sz w:val="15"/>
-              </w:rPr>
-              <w:t>Подключить push и SMS как адаптеры общей очереди доставки. Для аварий задать обязательный резервный канал, не добавляя новых экранов — только каналы в существующих настройках.</w:t>
-            </w:r>
-          </w:p>
-        </w:tc>
-      </w:tr>
-      <w:tr>
-        <w:trPr>
-          <w:cantSplit/>
-        </w:trPr>
-        <w:tc>
-          <w:tcPr>
-            <w:tcW w:type="dxa" w:w="2600"/>
-            <w:vAlign w:val="center"/>
-            <w:tcMar>
-              <w:top w:w="70" w:type="dxa"/>
-              <w:bottom w:w="70" w:type="dxa"/>
-              <w:start w:w="100" w:type="dxa"/>
-              <w:end w:w="100" w:type="dxa"/>
-            </w:tcMar>
-          </w:tcPr>
-          <w:p>
-            <w:pPr>
-              <w:spacing w:before="0" w:after="0" w:line="240" w:lineRule="auto"/>
-              <w:jc w:val="left"/>
-            </w:pPr>
-            <w:r>
-              <w:rPr>
-                <w:rFonts w:ascii="Calibri" w:hAnsi="Calibri"/>
-                <w:b/>
-                <w:color w:val="2E74B5"/>
-                <w:sz w:val="15"/>
-              </w:rPr>
-              <w:t>COM-02. Еженедельный дайджест</w:t>
-            </w:r>
-          </w:p>
-        </w:tc>
-        <w:tc>
-          <w:tcPr>
-            <w:tcW w:type="dxa" w:w="4200"/>
-            <w:vAlign w:val="center"/>
-            <w:tcMar>
-              <w:top w:w="70" w:type="dxa"/>
-              <w:bottom w:w="70" w:type="dxa"/>
-              <w:start w:w="100" w:type="dxa"/>
-              <w:end w:w="100" w:type="dxa"/>
-            </w:tcMar>
-          </w:tcPr>
-          <w:p>
-            <w:pPr>
-              <w:spacing w:before="0" w:after="0" w:line="240" w:lineRule="auto"/>
-              <w:jc w:val="left"/>
-            </w:pPr>
-            <w:r>
-              <w:rPr>
-                <w:rFonts w:ascii="Calibri" w:hAnsi="Calibri"/>
-                <w:b w:val="0"/>
-                <w:color w:val="243447"/>
-                <w:sz w:val="15"/>
-              </w:rPr>
-              <w:t>Дайджест автоматически собирает результаты, проекты, поступления и требуемые действия; председатель публикует его, после чего создаются уведомления и email-доставки.</w:t>
-            </w:r>
-          </w:p>
-        </w:tc>
-        <w:tc>
-          <w:tcPr>
-            <w:tcW w:type="dxa" w:w="1400"/>
-            <w:vAlign w:val="center"/>
-            <w:tcMar>
-              <w:top w:w="70" w:type="dxa"/>
-              <w:bottom w:w="70" w:type="dxa"/>
-              <w:start w:w="100" w:type="dxa"/>
-              <w:end w:w="100" w:type="dxa"/>
-            </w:tcMar>
-            <w:shd w:fill="E2F0D9"/>
-          </w:tcPr>
-          <w:p>
-            <w:pPr>
-              <w:spacing w:before="0" w:after="0" w:line="240" w:lineRule="auto"/>
-              <w:jc w:val="center"/>
-            </w:pPr>
-            <w:r>
-              <w:rPr>
-                <w:rFonts w:ascii="Calibri" w:hAnsi="Calibri"/>
-                <w:b/>
-                <w:color w:val="2E6B35"/>
-                <w:sz w:val="15"/>
-              </w:rPr>
-              <w:t>Реализовано</w:t>
-            </w:r>
-          </w:p>
-        </w:tc>
-        <w:tc>
-          <w:tcPr>
-            <w:tcW w:type="dxa" w:w="5936"/>
-            <w:vAlign w:val="center"/>
-            <w:tcMar>
-              <w:top w:w="70" w:type="dxa"/>
-              <w:bottom w:w="70" w:type="dxa"/>
-              <w:start w:w="100" w:type="dxa"/>
-              <w:end w:w="100" w:type="dxa"/>
-            </w:tcMar>
-          </w:tcPr>
-          <w:p>
-            <w:pPr>
-              <w:spacing w:before="0" w:after="0" w:line="240" w:lineRule="auto"/>
-              <w:jc w:val="left"/>
-            </w:pPr>
-            <w:r>
-              <w:rPr>
-                <w:rFonts w:ascii="Calibri" w:hAnsi="Calibri"/>
-                <w:b w:val="0"/>
-                <w:color w:val="265A61"/>
-                <w:sz w:val="15"/>
-              </w:rPr>
-              <w:t>Доработка не требуется; сохранить текущий сценарий и покрыть его регрессионными тестами.</w:t>
             </w:r>
           </w:p>
         </w:tc>
@@ -3818,9 +3818,237 @@
             </w:pPr>
             <w:r>
               <w:rPr>
-                <w:rFonts w:ascii="Calibri" w:hAnsi="Calibri"/>
+                <w:rFonts w:ascii="Calibri" w:hAnsi="Calibri" w:eastAsia="Calibri"/>
                 <w:b/>
-                <w:color w:val="2E74B5"/>
+                <w:color w:val="0070C0"/>
+                <w:sz w:val="15"/>
+              </w:rPr>
+              <w:t>COM-01. Приоритеты и контроль доставки уведомлений</w:t>
+            </w:r>
+          </w:p>
+        </w:tc>
+        <w:tc>
+          <w:tcPr>
+            <w:tcW w:type="dxa" w:w="4200"/>
+            <w:vAlign w:val="center"/>
+            <w:tcMar>
+              <w:top w:w="70" w:type="dxa"/>
+              <w:bottom w:w="70" w:type="dxa"/>
+              <w:start w:w="100" w:type="dxa"/>
+              <w:end w:w="100" w:type="dxa"/>
+            </w:tcMar>
+          </w:tcPr>
+          <w:p>
+            <w:pPr>
+              <w:spacing w:before="0" w:after="0" w:line="240" w:lineRule="auto"/>
+              <w:jc w:val="left"/>
+            </w:pPr>
+            <w:r>
+              <w:rPr>
+                <w:rFonts w:ascii="Calibri" w:hAnsi="Calibri" w:eastAsia="Calibri"/>
+                <w:b w:val="0"/>
+                <w:color w:val="24364B"/>
+                <w:sz w:val="15"/>
+              </w:rPr>
+              <w:t>Есть обычный, важный и аварийный приоритет, пользовательские настройки, уведомления в приложении, email-очередь, повторные попытки и реестр ошибок доставки. Нет push/SMS, адресного резервного канала и гарантированной доставки аварии при отключенных пользователем каналах.</w:t>
+            </w:r>
+          </w:p>
+        </w:tc>
+        <w:tc>
+          <w:tcPr>
+            <w:tcW w:type="dxa" w:w="1400"/>
+            <w:vAlign w:val="center"/>
+            <w:tcMar>
+              <w:top w:w="70" w:type="dxa"/>
+              <w:bottom w:w="70" w:type="dxa"/>
+              <w:start w:w="100" w:type="dxa"/>
+              <w:end w:w="100" w:type="dxa"/>
+            </w:tcMar>
+            <w:shd w:fill="FFF2CC"/>
+          </w:tcPr>
+          <w:p>
+            <w:pPr>
+              <w:spacing w:before="0" w:after="0" w:line="240" w:lineRule="auto"/>
+              <w:jc w:val="center"/>
+            </w:pPr>
+            <w:r>
+              <w:rPr>
+                <w:rFonts w:ascii="Calibri" w:hAnsi="Calibri" w:eastAsia="Calibri"/>
+                <w:b/>
+                <w:color w:val="7F6000"/>
+                <w:sz w:val="15"/>
+              </w:rPr>
+              <w:t>Частично</w:t>
+            </w:r>
+          </w:p>
+        </w:tc>
+        <w:tc>
+          <w:tcPr>
+            <w:tcW w:type="dxa" w:w="5936"/>
+            <w:vAlign w:val="center"/>
+            <w:tcMar>
+              <w:top w:w="70" w:type="dxa"/>
+              <w:bottom w:w="70" w:type="dxa"/>
+              <w:start w:w="100" w:type="dxa"/>
+              <w:end w:w="100" w:type="dxa"/>
+            </w:tcMar>
+          </w:tcPr>
+          <w:p>
+            <w:pPr>
+              <w:spacing w:before="0" w:after="0" w:line="240" w:lineRule="auto"/>
+              <w:jc w:val="left"/>
+            </w:pPr>
+            <w:r>
+              <w:rPr>
+                <w:rFonts w:ascii="Calibri" w:hAnsi="Calibri" w:eastAsia="Calibri"/>
+                <w:b w:val="0"/>
+                <w:color w:val="255E69"/>
+                <w:sz w:val="15"/>
+              </w:rPr>
+              <w:t>Подключить push и SMS как адаптеры общей очереди доставки. Для аварий задать обязательный резервный канал, не добавляя новых экранов — только каналы в существующих настройках.</w:t>
+            </w:r>
+          </w:p>
+        </w:tc>
+      </w:tr>
+      <w:tr>
+        <w:trPr>
+          <w:cantSplit/>
+        </w:trPr>
+        <w:tc>
+          <w:tcPr>
+            <w:tcW w:type="dxa" w:w="2600"/>
+            <w:vAlign w:val="center"/>
+            <w:tcMar>
+              <w:top w:w="70" w:type="dxa"/>
+              <w:bottom w:w="70" w:type="dxa"/>
+              <w:start w:w="100" w:type="dxa"/>
+              <w:end w:w="100" w:type="dxa"/>
+            </w:tcMar>
+          </w:tcPr>
+          <w:p>
+            <w:pPr>
+              <w:spacing w:before="0" w:after="0" w:line="240" w:lineRule="auto"/>
+              <w:jc w:val="left"/>
+            </w:pPr>
+            <w:r>
+              <w:rPr>
+                <w:rFonts w:ascii="Calibri" w:hAnsi="Calibri" w:eastAsia="Calibri"/>
+                <w:b/>
+                <w:color w:val="0070C0"/>
+                <w:sz w:val="15"/>
+              </w:rPr>
+              <w:t>COM-02. Еженедельный дайджест</w:t>
+            </w:r>
+          </w:p>
+        </w:tc>
+        <w:tc>
+          <w:tcPr>
+            <w:tcW w:type="dxa" w:w="4200"/>
+            <w:vAlign w:val="center"/>
+            <w:tcMar>
+              <w:top w:w="70" w:type="dxa"/>
+              <w:bottom w:w="70" w:type="dxa"/>
+              <w:start w:w="100" w:type="dxa"/>
+              <w:end w:w="100" w:type="dxa"/>
+            </w:tcMar>
+          </w:tcPr>
+          <w:p>
+            <w:pPr>
+              <w:spacing w:before="0" w:after="0" w:line="240" w:lineRule="auto"/>
+              <w:jc w:val="left"/>
+            </w:pPr>
+            <w:r>
+              <w:rPr>
+                <w:rFonts w:ascii="Calibri" w:hAnsi="Calibri" w:eastAsia="Calibri"/>
+                <w:b w:val="0"/>
+                <w:color w:val="24364B"/>
+                <w:sz w:val="15"/>
+              </w:rPr>
+              <w:t>Дайджест автоматически собирает результаты, проекты, поступления и требуемые действия; председатель публикует его, после чего создаются уведомления и email-доставки.</w:t>
+            </w:r>
+          </w:p>
+        </w:tc>
+        <w:tc>
+          <w:tcPr>
+            <w:tcW w:type="dxa" w:w="1400"/>
+            <w:vAlign w:val="center"/>
+            <w:tcMar>
+              <w:top w:w="70" w:type="dxa"/>
+              <w:bottom w:w="70" w:type="dxa"/>
+              <w:start w:w="100" w:type="dxa"/>
+              <w:end w:w="100" w:type="dxa"/>
+            </w:tcMar>
+            <w:shd w:fill="E2F0D9"/>
+          </w:tcPr>
+          <w:p>
+            <w:pPr>
+              <w:spacing w:before="0" w:after="0" w:line="240" w:lineRule="auto"/>
+              <w:jc w:val="center"/>
+            </w:pPr>
+            <w:r>
+              <w:rPr>
+                <w:rFonts w:ascii="Calibri" w:hAnsi="Calibri" w:eastAsia="Calibri"/>
+                <w:b/>
+                <w:color w:val="2E6B2E"/>
+                <w:sz w:val="15"/>
+              </w:rPr>
+              <w:t>Реализовано</w:t>
+            </w:r>
+          </w:p>
+        </w:tc>
+        <w:tc>
+          <w:tcPr>
+            <w:tcW w:type="dxa" w:w="5936"/>
+            <w:vAlign w:val="center"/>
+            <w:tcMar>
+              <w:top w:w="70" w:type="dxa"/>
+              <w:bottom w:w="70" w:type="dxa"/>
+              <w:start w:w="100" w:type="dxa"/>
+              <w:end w:w="100" w:type="dxa"/>
+            </w:tcMar>
+          </w:tcPr>
+          <w:p>
+            <w:pPr>
+              <w:spacing w:before="0" w:after="0" w:line="240" w:lineRule="auto"/>
+              <w:jc w:val="left"/>
+            </w:pPr>
+            <w:r>
+              <w:rPr>
+                <w:rFonts w:ascii="Calibri" w:hAnsi="Calibri" w:eastAsia="Calibri"/>
+                <w:b w:val="0"/>
+                <w:color w:val="255E69"/>
+                <w:sz w:val="15"/>
+              </w:rPr>
+              <w:t>Доработка не требуется; сохранить текущий сценарий и покрыть его регрессионными тестами.</w:t>
+            </w:r>
+          </w:p>
+        </w:tc>
+      </w:tr>
+      <w:tr>
+        <w:trPr>
+          <w:cantSplit/>
+        </w:trPr>
+        <w:tc>
+          <w:tcPr>
+            <w:tcW w:type="dxa" w:w="2600"/>
+            <w:vAlign w:val="center"/>
+            <w:tcMar>
+              <w:top w:w="70" w:type="dxa"/>
+              <w:bottom w:w="70" w:type="dxa"/>
+              <w:start w:w="100" w:type="dxa"/>
+              <w:end w:w="100" w:type="dxa"/>
+            </w:tcMar>
+          </w:tcPr>
+          <w:p>
+            <w:pPr>
+              <w:spacing w:before="0" w:after="0" w:line="240" w:lineRule="auto"/>
+              <w:jc w:val="left"/>
+            </w:pPr>
+            <w:r>
+              <w:rPr>
+                <w:rFonts w:ascii="Calibri" w:hAnsi="Calibri" w:eastAsia="Calibri"/>
+                <w:b/>
+                <w:color w:val="0070C0"/>
                 <w:sz w:val="15"/>
               </w:rPr>
               <w:t>COM-03. Инструкции и полезные контакты для новичка</w:t>
@@ -3845,9 +4073,9 @@
             </w:pPr>
             <w:r>
               <w:rPr>
-                <w:rFonts w:ascii="Calibri" w:hAnsi="Calibri"/>
+                <w:rFonts w:ascii="Calibri" w:hAnsi="Calibri" w:eastAsia="Calibri"/>
                 <w:b w:val="0"/>
-                <w:color w:val="243447"/>
+                <w:color w:val="24364B"/>
                 <w:sz w:val="15"/>
               </w:rPr>
               <w:t>Есть адрес поселка, полезные контакты, FAQ, правила, инструкции подключения и уставные документы. Нет владельца материала, даты следующей проверки, версий статьи и маршрута сообщения об устаревшем контакте.</w:t>
@@ -3873,9 +4101,9 @@
             </w:pPr>
             <w:r>
               <w:rPr>
-                <w:rFonts w:ascii="Calibri" w:hAnsi="Calibri"/>
+                <w:rFonts w:ascii="Calibri" w:hAnsi="Calibri" w:eastAsia="Calibri"/>
                 <w:b/>
-                <w:color w:val="7A5A00"/>
+                <w:color w:val="7F6000"/>
                 <w:sz w:val="15"/>
               </w:rPr>
               <w:t>Частично</w:t>
@@ -3900,9 +4128,9 @@
             </w:pPr>
             <w:r>
               <w:rPr>
-                <w:rFonts w:ascii="Calibri" w:hAnsi="Calibri"/>
+                <w:rFonts w:ascii="Calibri" w:hAnsi="Calibri" w:eastAsia="Calibri"/>
                 <w:b w:val="0"/>
-                <w:color w:val="265A61"/>
+                <w:color w:val="255E69"/>
                 <w:sz w:val="15"/>
               </w:rPr>
               <w:t>Добавить материалу владельца, дату проверки и действие «Сообщить об устаревании». Версии хранить автоматически, а метаданные показывать только в режиме редактирования.</w:t>
@@ -3932,9 +4160,9 @@
             </w:pPr>
             <w:r>
               <w:rPr>
-                <w:rFonts w:ascii="Calibri" w:hAnsi="Calibri"/>
+                <w:rFonts w:ascii="Calibri" w:hAnsi="Calibri" w:eastAsia="Calibri"/>
                 <w:b/>
-                <w:color w:val="2E74B5"/>
+                <w:color w:val="0070C0"/>
                 <w:sz w:val="15"/>
               </w:rPr>
               <w:t>COM-04. Каталог навыков и доска услуг</w:t>
@@ -3959,9 +4187,9 @@
             </w:pPr>
             <w:r>
               <w:rPr>
-                <w:rFonts w:ascii="Calibri" w:hAnsi="Calibri"/>
+                <w:rFonts w:ascii="Calibri" w:hAnsi="Calibri" w:eastAsia="Calibri"/>
                 <w:b w:val="0"/>
-                <w:color w:val="243447"/>
+                <w:color w:val="24364B"/>
                 <w:sz w:val="15"/>
               </w:rPr>
               <w:t>Реализованы добровольный публичный профиль, настройки видимости телефона и email, поиск по навыку и улице, объявления «предлагаю/ищу» и закрытие объявления. Нет срока публикации, очереди модерации, жалобы и формализованного отзыва согласия с историей обработки.</w:t>
@@ -3987,9 +4215,9 @@
             </w:pPr>
             <w:r>
               <w:rPr>
-                <w:rFonts w:ascii="Calibri" w:hAnsi="Calibri"/>
+                <w:rFonts w:ascii="Calibri" w:hAnsi="Calibri" w:eastAsia="Calibri"/>
                 <w:b/>
-                <w:color w:val="7A5A00"/>
+                <w:color w:val="7F6000"/>
                 <w:sz w:val="15"/>
               </w:rPr>
               <w:t>Частично</w:t>
@@ -4014,9 +4242,9 @@
             </w:pPr>
             <w:r>
               <w:rPr>
-                <w:rFonts w:ascii="Calibri" w:hAnsi="Calibri"/>
+                <w:rFonts w:ascii="Calibri" w:hAnsi="Calibri" w:eastAsia="Calibri"/>
                 <w:b w:val="0"/>
-                <w:color w:val="265A61"/>
+                <w:color w:val="255E69"/>
                 <w:sz w:val="15"/>
               </w:rPr>
               <w:t>Добавить срок объявления, действие «Пожаловаться» и общую очередь модерации со счетчиком. Отзыв согласия оформить переключателем профиля с записью в аудит.</w:t>
@@ -4046,9 +4274,9 @@
             </w:pPr>
             <w:r>
               <w:rPr>
-                <w:rFonts w:ascii="Calibri" w:hAnsi="Calibri"/>
+                <w:rFonts w:ascii="Calibri" w:hAnsi="Calibri" w:eastAsia="Calibri"/>
                 <w:b/>
-                <w:color w:val="2E74B5"/>
+                <w:color w:val="0070C0"/>
                 <w:sz w:val="15"/>
               </w:rPr>
               <w:t>DOC-01. Публичные, внутренние и персональные документы</w:t>
@@ -4073,9 +4301,9 @@
             </w:pPr>
             <w:r>
               <w:rPr>
-                <w:rFonts w:ascii="Calibri" w:hAnsi="Calibri"/>
+                <w:rFonts w:ascii="Calibri" w:hAnsi="Calibri" w:eastAsia="Calibri"/>
                 <w:b w:val="0"/>
-                <w:color w:val="243447"/>
+                <w:color w:val="24364B"/>
                 <w:sz w:val="15"/>
               </w:rPr>
               <w:t>Файлы имеют уровни «для поселка» и «для управления», доступ проверяется сервером. Персонального уровня нет; реестр документов использует только признак публикации, а общий поиск недостаточно разделяет документы и финансовые сведения по ролям.</w:t>
@@ -4101,9 +4329,9 @@
             </w:pPr>
             <w:r>
               <w:rPr>
-                <w:rFonts w:ascii="Calibri" w:hAnsi="Calibri"/>
+                <w:rFonts w:ascii="Calibri" w:hAnsi="Calibri" w:eastAsia="Calibri"/>
                 <w:b/>
-                <w:color w:val="7A5A00"/>
+                <w:color w:val="7F6000"/>
                 <w:sz w:val="15"/>
               </w:rPr>
               <w:t>Частично</w:t>
@@ -4128,240 +4356,12 @@
             </w:pPr>
             <w:r>
               <w:rPr>
-                <w:rFonts w:ascii="Calibri" w:hAnsi="Calibri"/>
+                <w:rFonts w:ascii="Calibri" w:hAnsi="Calibri" w:eastAsia="Calibri"/>
                 <w:b w:val="0"/>
-                <w:color w:val="265A61"/>
+                <w:color w:val="255E69"/>
                 <w:sz w:val="15"/>
               </w:rPr>
               <w:t>Добавить уровень «персональный» и единый серверный фильтр видимости для файлов, документов и поиска. В интерфейсе достаточно цветной метки доступа и существующих фильтров.</w:t>
-            </w:r>
-          </w:p>
-        </w:tc>
-      </w:tr>
-      <w:tr>
-        <w:trPr>
-          <w:cantSplit/>
-        </w:trPr>
-        <w:tc>
-          <w:tcPr>
-            <w:tcW w:type="dxa" w:w="2600"/>
-            <w:vAlign w:val="center"/>
-            <w:tcMar>
-              <w:top w:w="70" w:type="dxa"/>
-              <w:bottom w:w="70" w:type="dxa"/>
-              <w:start w:w="100" w:type="dxa"/>
-              <w:end w:w="100" w:type="dxa"/>
-            </w:tcMar>
-          </w:tcPr>
-          <w:p>
-            <w:pPr>
-              <w:spacing w:before="0" w:after="0" w:line="240" w:lineRule="auto"/>
-              <w:jc w:val="left"/>
-            </w:pPr>
-            <w:r>
-              <w:rPr>
-                <w:rFonts w:ascii="Calibri" w:hAnsi="Calibri"/>
-                <w:b/>
-                <w:color w:val="2E74B5"/>
-                <w:sz w:val="15"/>
-              </w:rPr>
-              <w:t>DOC-02. Версии и сроки действия документов</w:t>
-            </w:r>
-          </w:p>
-        </w:tc>
-        <w:tc>
-          <w:tcPr>
-            <w:tcW w:type="dxa" w:w="4200"/>
-            <w:vAlign w:val="center"/>
-            <w:tcMar>
-              <w:top w:w="70" w:type="dxa"/>
-              <w:bottom w:w="70" w:type="dxa"/>
-              <w:start w:w="100" w:type="dxa"/>
-              <w:end w:w="100" w:type="dxa"/>
-            </w:tcMar>
-          </w:tcPr>
-          <w:p>
-            <w:pPr>
-              <w:spacing w:before="0" w:after="0" w:line="240" w:lineRule="auto"/>
-              <w:jc w:val="left"/>
-            </w:pPr>
-            <w:r>
-              <w:rPr>
-                <w:rFonts w:ascii="Calibri" w:hAnsi="Calibri"/>
-                <w:b w:val="0"/>
-                <w:color w:val="243447"/>
-                <w:sz w:val="15"/>
-              </w:rPr>
-              <w:t>Можно загрузить новый документ и связать его с решением, проектом, расходом или подрядчиком. Нет номера редакции, даты вступления и окончания действия, связи «заменяет документ» и выбора версии, действовавшей на заданную дату.</w:t>
-            </w:r>
-          </w:p>
-        </w:tc>
-        <w:tc>
-          <w:tcPr>
-            <w:tcW w:type="dxa" w:w="1400"/>
-            <w:vAlign w:val="center"/>
-            <w:tcMar>
-              <w:top w:w="70" w:type="dxa"/>
-              <w:bottom w:w="70" w:type="dxa"/>
-              <w:start w:w="100" w:type="dxa"/>
-              <w:end w:w="100" w:type="dxa"/>
-            </w:tcMar>
-            <w:shd w:fill="FCE4E4"/>
-          </w:tcPr>
-          <w:p>
-            <w:pPr>
-              <w:spacing w:before="0" w:after="0" w:line="240" w:lineRule="auto"/>
-              <w:jc w:val="center"/>
-            </w:pPr>
-            <w:r>
-              <w:rPr>
-                <w:rFonts w:ascii="Calibri" w:hAnsi="Calibri"/>
-                <w:b/>
-                <w:color w:val="9B1C1C"/>
-                <w:sz w:val="15"/>
-              </w:rPr>
-              <w:t>Нет</w:t>
-            </w:r>
-          </w:p>
-        </w:tc>
-        <w:tc>
-          <w:tcPr>
-            <w:tcW w:type="dxa" w:w="5936"/>
-            <w:vAlign w:val="center"/>
-            <w:tcMar>
-              <w:top w:w="70" w:type="dxa"/>
-              <w:bottom w:w="70" w:type="dxa"/>
-              <w:start w:w="100" w:type="dxa"/>
-              <w:end w:w="100" w:type="dxa"/>
-            </w:tcMar>
-          </w:tcPr>
-          <w:p>
-            <w:pPr>
-              <w:spacing w:before="0" w:after="0" w:line="240" w:lineRule="auto"/>
-              <w:jc w:val="left"/>
-            </w:pPr>
-            <w:r>
-              <w:rPr>
-                <w:rFonts w:ascii="Calibri" w:hAnsi="Calibri"/>
-                <w:b w:val="0"/>
-                <w:color w:val="265A61"/>
-                <w:sz w:val="15"/>
-              </w:rPr>
-              <w:t>Ввести сущность версии документа с датами действия и ссылкой на заменяемую редакцию. Выбор версии показывать в боковой панели карточки файла.</w:t>
-            </w:r>
-          </w:p>
-        </w:tc>
-      </w:tr>
-      <w:tr>
-        <w:trPr>
-          <w:cantSplit/>
-        </w:trPr>
-        <w:tc>
-          <w:tcPr>
-            <w:tcW w:type="dxa" w:w="2600"/>
-            <w:vAlign w:val="center"/>
-            <w:tcMar>
-              <w:top w:w="70" w:type="dxa"/>
-              <w:bottom w:w="70" w:type="dxa"/>
-              <w:start w:w="100" w:type="dxa"/>
-              <w:end w:w="100" w:type="dxa"/>
-            </w:tcMar>
-          </w:tcPr>
-          <w:p>
-            <w:pPr>
-              <w:spacing w:before="0" w:after="0" w:line="240" w:lineRule="auto"/>
-              <w:jc w:val="left"/>
-            </w:pPr>
-            <w:r>
-              <w:rPr>
-                <w:rFonts w:ascii="Calibri" w:hAnsi="Calibri"/>
-                <w:b/>
-                <w:color w:val="2E74B5"/>
-                <w:sz w:val="15"/>
-              </w:rPr>
-              <w:t>SEC-01. Изоляция данных разных поселков</w:t>
-            </w:r>
-          </w:p>
-        </w:tc>
-        <w:tc>
-          <w:tcPr>
-            <w:tcW w:type="dxa" w:w="4200"/>
-            <w:vAlign w:val="center"/>
-            <w:tcMar>
-              <w:top w:w="70" w:type="dxa"/>
-              <w:bottom w:w="70" w:type="dxa"/>
-              <w:start w:w="100" w:type="dxa"/>
-              <w:end w:w="100" w:type="dxa"/>
-            </w:tcMar>
-          </w:tcPr>
-          <w:p>
-            <w:pPr>
-              <w:spacing w:before="0" w:after="0" w:line="240" w:lineRule="auto"/>
-              <w:jc w:val="left"/>
-            </w:pPr>
-            <w:r>
-              <w:rPr>
-                <w:rFonts w:ascii="Calibri" w:hAnsi="Calibri"/>
-                <w:b w:val="0"/>
-                <w:color w:val="243447"/>
-                <w:sz w:val="15"/>
-              </w:rPr>
-              <w:t>Членство и JWT содержат поселок; API повторно загружает членство, а основные запросы фильтруются по communityId. Пользователь может иметь разные роли в разных поселках.</w:t>
-            </w:r>
-          </w:p>
-        </w:tc>
-        <w:tc>
-          <w:tcPr>
-            <w:tcW w:type="dxa" w:w="1400"/>
-            <w:vAlign w:val="center"/>
-            <w:tcMar>
-              <w:top w:w="70" w:type="dxa"/>
-              <w:bottom w:w="70" w:type="dxa"/>
-              <w:start w:w="100" w:type="dxa"/>
-              <w:end w:w="100" w:type="dxa"/>
-            </w:tcMar>
-            <w:shd w:fill="E2F0D9"/>
-          </w:tcPr>
-          <w:p>
-            <w:pPr>
-              <w:spacing w:before="0" w:after="0" w:line="240" w:lineRule="auto"/>
-              <w:jc w:val="center"/>
-            </w:pPr>
-            <w:r>
-              <w:rPr>
-                <w:rFonts w:ascii="Calibri" w:hAnsi="Calibri"/>
-                <w:b/>
-                <w:color w:val="2E6B35"/>
-                <w:sz w:val="15"/>
-              </w:rPr>
-              <w:t>Реализовано</w:t>
-            </w:r>
-          </w:p>
-        </w:tc>
-        <w:tc>
-          <w:tcPr>
-            <w:tcW w:type="dxa" w:w="5936"/>
-            <w:vAlign w:val="center"/>
-            <w:tcMar>
-              <w:top w:w="70" w:type="dxa"/>
-              <w:bottom w:w="70" w:type="dxa"/>
-              <w:start w:w="100" w:type="dxa"/>
-              <w:end w:w="100" w:type="dxa"/>
-            </w:tcMar>
-          </w:tcPr>
-          <w:p>
-            <w:pPr>
-              <w:spacing w:before="0" w:after="0" w:line="240" w:lineRule="auto"/>
-              <w:jc w:val="left"/>
-            </w:pPr>
-            <w:r>
-              <w:rPr>
-                <w:rFonts w:ascii="Calibri" w:hAnsi="Calibri"/>
-                <w:b w:val="0"/>
-                <w:color w:val="265A61"/>
-                <w:sz w:val="15"/>
-              </w:rPr>
-              <w:t>Доработка не требуется; закрепить изоляцию автоматическими тестами на каждый новый API-модуль.</w:t>
             </w:r>
           </w:p>
         </w:tc>
@@ -4549,9 +4549,237 @@
             </w:pPr>
             <w:r>
               <w:rPr>
-                <w:rFonts w:ascii="Calibri" w:hAnsi="Calibri"/>
+                <w:rFonts w:ascii="Calibri" w:hAnsi="Calibri" w:eastAsia="Calibri"/>
                 <w:b/>
-                <w:color w:val="2E74B5"/>
+                <w:color w:val="0070C0"/>
+                <w:sz w:val="15"/>
+              </w:rPr>
+              <w:t>DOC-02. Версии и сроки действия документов</w:t>
+            </w:r>
+          </w:p>
+        </w:tc>
+        <w:tc>
+          <w:tcPr>
+            <w:tcW w:type="dxa" w:w="4200"/>
+            <w:vAlign w:val="center"/>
+            <w:tcMar>
+              <w:top w:w="70" w:type="dxa"/>
+              <w:bottom w:w="70" w:type="dxa"/>
+              <w:start w:w="100" w:type="dxa"/>
+              <w:end w:w="100" w:type="dxa"/>
+            </w:tcMar>
+          </w:tcPr>
+          <w:p>
+            <w:pPr>
+              <w:spacing w:before="0" w:after="0" w:line="240" w:lineRule="auto"/>
+              <w:jc w:val="left"/>
+            </w:pPr>
+            <w:r>
+              <w:rPr>
+                <w:rFonts w:ascii="Calibri" w:hAnsi="Calibri" w:eastAsia="Calibri"/>
+                <w:b w:val="0"/>
+                <w:color w:val="24364B"/>
+                <w:sz w:val="15"/>
+              </w:rPr>
+              <w:t>Можно загрузить новый документ и связать его с решением, проектом, расходом или подрядчиком. Нет номера редакции, даты вступления и окончания действия, связи «заменяет документ» и выбора версии, действовавшей на заданную дату.</w:t>
+            </w:r>
+          </w:p>
+        </w:tc>
+        <w:tc>
+          <w:tcPr>
+            <w:tcW w:type="dxa" w:w="1400"/>
+            <w:vAlign w:val="center"/>
+            <w:tcMar>
+              <w:top w:w="70" w:type="dxa"/>
+              <w:bottom w:w="70" w:type="dxa"/>
+              <w:start w:w="100" w:type="dxa"/>
+              <w:end w:w="100" w:type="dxa"/>
+            </w:tcMar>
+            <w:shd w:fill="FCE4E4"/>
+          </w:tcPr>
+          <w:p>
+            <w:pPr>
+              <w:spacing w:before="0" w:after="0" w:line="240" w:lineRule="auto"/>
+              <w:jc w:val="center"/>
+            </w:pPr>
+            <w:r>
+              <w:rPr>
+                <w:rFonts w:ascii="Calibri" w:hAnsi="Calibri" w:eastAsia="Calibri"/>
+                <w:b/>
+                <w:color w:val="A61C1C"/>
+                <w:sz w:val="15"/>
+              </w:rPr>
+              <w:t>Нет</w:t>
+            </w:r>
+          </w:p>
+        </w:tc>
+        <w:tc>
+          <w:tcPr>
+            <w:tcW w:type="dxa" w:w="5936"/>
+            <w:vAlign w:val="center"/>
+            <w:tcMar>
+              <w:top w:w="70" w:type="dxa"/>
+              <w:bottom w:w="70" w:type="dxa"/>
+              <w:start w:w="100" w:type="dxa"/>
+              <w:end w:w="100" w:type="dxa"/>
+            </w:tcMar>
+          </w:tcPr>
+          <w:p>
+            <w:pPr>
+              <w:spacing w:before="0" w:after="0" w:line="240" w:lineRule="auto"/>
+              <w:jc w:val="left"/>
+            </w:pPr>
+            <w:r>
+              <w:rPr>
+                <w:rFonts w:ascii="Calibri" w:hAnsi="Calibri" w:eastAsia="Calibri"/>
+                <w:b w:val="0"/>
+                <w:color w:val="255E69"/>
+                <w:sz w:val="15"/>
+              </w:rPr>
+              <w:t>Ввести сущность версии документа с датами действия и ссылкой на заменяемую редакцию. Выбор версии показывать в боковой панели карточки файла.</w:t>
+            </w:r>
+          </w:p>
+        </w:tc>
+      </w:tr>
+      <w:tr>
+        <w:trPr>
+          <w:cantSplit/>
+        </w:trPr>
+        <w:tc>
+          <w:tcPr>
+            <w:tcW w:type="dxa" w:w="2600"/>
+            <w:vAlign w:val="center"/>
+            <w:tcMar>
+              <w:top w:w="70" w:type="dxa"/>
+              <w:bottom w:w="70" w:type="dxa"/>
+              <w:start w:w="100" w:type="dxa"/>
+              <w:end w:w="100" w:type="dxa"/>
+            </w:tcMar>
+          </w:tcPr>
+          <w:p>
+            <w:pPr>
+              <w:spacing w:before="0" w:after="0" w:line="240" w:lineRule="auto"/>
+              <w:jc w:val="left"/>
+            </w:pPr>
+            <w:r>
+              <w:rPr>
+                <w:rFonts w:ascii="Calibri" w:hAnsi="Calibri" w:eastAsia="Calibri"/>
+                <w:b/>
+                <w:color w:val="0070C0"/>
+                <w:sz w:val="15"/>
+              </w:rPr>
+              <w:t>SEC-01. Изоляция данных разных поселков</w:t>
+            </w:r>
+          </w:p>
+        </w:tc>
+        <w:tc>
+          <w:tcPr>
+            <w:tcW w:type="dxa" w:w="4200"/>
+            <w:vAlign w:val="center"/>
+            <w:tcMar>
+              <w:top w:w="70" w:type="dxa"/>
+              <w:bottom w:w="70" w:type="dxa"/>
+              <w:start w:w="100" w:type="dxa"/>
+              <w:end w:w="100" w:type="dxa"/>
+            </w:tcMar>
+          </w:tcPr>
+          <w:p>
+            <w:pPr>
+              <w:spacing w:before="0" w:after="0" w:line="240" w:lineRule="auto"/>
+              <w:jc w:val="left"/>
+            </w:pPr>
+            <w:r>
+              <w:rPr>
+                <w:rFonts w:ascii="Calibri" w:hAnsi="Calibri" w:eastAsia="Calibri"/>
+                <w:b w:val="0"/>
+                <w:color w:val="24364B"/>
+                <w:sz w:val="15"/>
+              </w:rPr>
+              <w:t>Членство и JWT содержат поселок; API повторно загружает членство, а основные запросы фильтруются по communityId. Пользователь может иметь разные роли в разных поселках.</w:t>
+            </w:r>
+          </w:p>
+        </w:tc>
+        <w:tc>
+          <w:tcPr>
+            <w:tcW w:type="dxa" w:w="1400"/>
+            <w:vAlign w:val="center"/>
+            <w:tcMar>
+              <w:top w:w="70" w:type="dxa"/>
+              <w:bottom w:w="70" w:type="dxa"/>
+              <w:start w:w="100" w:type="dxa"/>
+              <w:end w:w="100" w:type="dxa"/>
+            </w:tcMar>
+            <w:shd w:fill="E2F0D9"/>
+          </w:tcPr>
+          <w:p>
+            <w:pPr>
+              <w:spacing w:before="0" w:after="0" w:line="240" w:lineRule="auto"/>
+              <w:jc w:val="center"/>
+            </w:pPr>
+            <w:r>
+              <w:rPr>
+                <w:rFonts w:ascii="Calibri" w:hAnsi="Calibri" w:eastAsia="Calibri"/>
+                <w:b/>
+                <w:color w:val="2E6B2E"/>
+                <w:sz w:val="15"/>
+              </w:rPr>
+              <w:t>Реализовано</w:t>
+            </w:r>
+          </w:p>
+        </w:tc>
+        <w:tc>
+          <w:tcPr>
+            <w:tcW w:type="dxa" w:w="5936"/>
+            <w:vAlign w:val="center"/>
+            <w:tcMar>
+              <w:top w:w="70" w:type="dxa"/>
+              <w:bottom w:w="70" w:type="dxa"/>
+              <w:start w:w="100" w:type="dxa"/>
+              <w:end w:w="100" w:type="dxa"/>
+            </w:tcMar>
+          </w:tcPr>
+          <w:p>
+            <w:pPr>
+              <w:spacing w:before="0" w:after="0" w:line="240" w:lineRule="auto"/>
+              <w:jc w:val="left"/>
+            </w:pPr>
+            <w:r>
+              <w:rPr>
+                <w:rFonts w:ascii="Calibri" w:hAnsi="Calibri" w:eastAsia="Calibri"/>
+                <w:b w:val="0"/>
+                <w:color w:val="255E69"/>
+                <w:sz w:val="15"/>
+              </w:rPr>
+              <w:t>Доработка не требуется; закрепить изоляцию автоматическими тестами на каждый новый API-модуль.</w:t>
+            </w:r>
+          </w:p>
+        </w:tc>
+      </w:tr>
+      <w:tr>
+        <w:trPr>
+          <w:cantSplit/>
+        </w:trPr>
+        <w:tc>
+          <w:tcPr>
+            <w:tcW w:type="dxa" w:w="2600"/>
+            <w:vAlign w:val="center"/>
+            <w:tcMar>
+              <w:top w:w="70" w:type="dxa"/>
+              <w:bottom w:w="70" w:type="dxa"/>
+              <w:start w:w="100" w:type="dxa"/>
+              <w:end w:w="100" w:type="dxa"/>
+            </w:tcMar>
+          </w:tcPr>
+          <w:p>
+            <w:pPr>
+              <w:spacing w:before="0" w:after="0" w:line="240" w:lineRule="auto"/>
+              <w:jc w:val="left"/>
+            </w:pPr>
+            <w:r>
+              <w:rPr>
+                <w:rFonts w:ascii="Calibri" w:hAnsi="Calibri" w:eastAsia="Calibri"/>
+                <w:b/>
+                <w:color w:val="0070C0"/>
                 <w:sz w:val="15"/>
               </w:rPr>
               <w:t>SEC-02. Серверные права и отзыв доступа</w:t>
@@ -4576,9 +4804,9 @@
             </w:pPr>
             <w:r>
               <w:rPr>
-                <w:rFonts w:ascii="Calibri" w:hAnsi="Calibri"/>
+                <w:rFonts w:ascii="Calibri" w:hAnsi="Calibri" w:eastAsia="Calibri"/>
                 <w:b w:val="0"/>
-                <w:color w:val="243447"/>
+                <w:color w:val="24364B"/>
                 <w:sz w:val="15"/>
               </w:rPr>
               <w:t>Роли проверяются middleware на сервере; приостановленное членство блокируется при каждом запросе, поэтому старая сессия не сохраняет доступ. Нет специального журнала отказов и подозрительных попыток, временных разрешений и тонких полномочий.</w:t>
@@ -4604,9 +4832,9 @@
             </w:pPr>
             <w:r>
               <w:rPr>
-                <w:rFonts w:ascii="Calibri" w:hAnsi="Calibri"/>
+                <w:rFonts w:ascii="Calibri" w:hAnsi="Calibri" w:eastAsia="Calibri"/>
                 <w:b/>
-                <w:color w:val="7A5A00"/>
+                <w:color w:val="7F6000"/>
                 <w:sz w:val="15"/>
               </w:rPr>
               <w:t>Частично</w:t>
@@ -4631,9 +4859,9 @@
             </w:pPr>
             <w:r>
               <w:rPr>
-                <w:rFonts w:ascii="Calibri" w:hAnsi="Calibri"/>
+                <w:rFonts w:ascii="Calibri" w:hAnsi="Calibri" w:eastAsia="Calibri"/>
                 <w:b w:val="0"/>
-                <w:color w:val="265A61"/>
+                <w:color w:val="255E69"/>
                 <w:sz w:val="15"/>
               </w:rPr>
               <w:t>Добавить временные разрешения поверх ролей, журнал отказов и повторное подтверждение чувствительных действий. Настройку оставить в текущем диалоге ролей и аудите.</w:t>
@@ -4663,9 +4891,9 @@
             </w:pPr>
             <w:r>
               <w:rPr>
-                <w:rFonts w:ascii="Calibri" w:hAnsi="Calibri"/>
+                <w:rFonts w:ascii="Calibri" w:hAnsi="Calibri" w:eastAsia="Calibri"/>
                 <w:b/>
-                <w:color w:val="2E74B5"/>
+                <w:color w:val="0070C0"/>
                 <w:sz w:val="15"/>
               </w:rPr>
               <w:t>SEC-03. Восстановление истории спорной операции</w:t>
@@ -4690,9 +4918,9 @@
             </w:pPr>
             <w:r>
               <w:rPr>
-                <w:rFonts w:ascii="Calibri" w:hAnsi="Calibri"/>
+                <w:rFonts w:ascii="Calibri" w:hAnsi="Calibri" w:eastAsia="Calibri"/>
                 <w:b w:val="0"/>
-                <w:color w:val="243447"/>
+                <w:color w:val="24364B"/>
                 <w:sz w:val="15"/>
               </w:rPr>
               <w:t>Аудит хранит автора, время, действие, состояние до и после для большинства управленческих операций и позволяет фильтровать историю объекта. Не все изменения имеют обязательное основание; часть операций и отказов не журналируется, удаленный файл не сохраняется как доказательство.</w:t>
@@ -4718,9 +4946,9 @@
             </w:pPr>
             <w:r>
               <w:rPr>
-                <w:rFonts w:ascii="Calibri" w:hAnsi="Calibri"/>
+                <w:rFonts w:ascii="Calibri" w:hAnsi="Calibri" w:eastAsia="Calibri"/>
                 <w:b/>
-                <w:color w:val="7A5A00"/>
+                <w:color w:val="7F6000"/>
                 <w:sz w:val="15"/>
               </w:rPr>
               <w:t>Частично</w:t>
@@ -4745,9 +4973,9 @@
             </w:pPr>
             <w:r>
               <w:rPr>
-                <w:rFonts w:ascii="Calibri" w:hAnsi="Calibri"/>
+                <w:rFonts w:ascii="Calibri" w:hAnsi="Calibri" w:eastAsia="Calibri"/>
                 <w:b w:val="0"/>
-                <w:color w:val="265A61"/>
+                <w:color w:val="255E69"/>
                 <w:sz w:val="15"/>
               </w:rPr>
               <w:t>Требовать причину для финансовых и статусных изменений, журналировать отказы и заменять физическое удаление доказательств мягким удалением. Использовать существующий экран аудита.</w:t>
@@ -4777,9 +5005,9 @@
             </w:pPr>
             <w:r>
               <w:rPr>
-                <w:rFonts w:ascii="Calibri" w:hAnsi="Calibri"/>
+                <w:rFonts w:ascii="Calibri" w:hAnsi="Calibri" w:eastAsia="Calibri"/>
                 <w:b/>
-                <w:color w:val="2E74B5"/>
+                <w:color w:val="0070C0"/>
                 <w:sz w:val="15"/>
               </w:rPr>
               <w:t>SEC-04. Нестабильная сеть и повторная отправка</w:t>
@@ -4804,9 +5032,9 @@
             </w:pPr>
             <w:r>
               <w:rPr>
-                <w:rFonts w:ascii="Calibri" w:hAnsi="Calibri"/>
+                <w:rFonts w:ascii="Calibri" w:hAnsi="Calibri" w:eastAsia="Calibri"/>
                 <w:b w:val="0"/>
-                <w:color w:val="243447"/>
+                <w:color w:val="24364B"/>
                 <w:sz w:val="15"/>
               </w:rPr>
               <w:t>PWA показывает офлайн-страницу и не кэширует приватные API-ответы. Идемпотентные ключи и защита от повторного создания платежа, расхода или обращения отсутствуют; разрешение конфликтов параллельного редактирования не реализовано.</w:t>
@@ -4832,9 +5060,9 @@
             </w:pPr>
             <w:r>
               <w:rPr>
-                <w:rFonts w:ascii="Calibri" w:hAnsi="Calibri"/>
+                <w:rFonts w:ascii="Calibri" w:hAnsi="Calibri" w:eastAsia="Calibri"/>
                 <w:b/>
-                <w:color w:val="7A5A00"/>
+                <w:color w:val="7F6000"/>
                 <w:sz w:val="15"/>
               </w:rPr>
               <w:t>Частично</w:t>
@@ -4859,12 +5087,173 @@
             </w:pPr>
             <w:r>
               <w:rPr>
-                <w:rFonts w:ascii="Calibri" w:hAnsi="Calibri"/>
+                <w:rFonts w:ascii="Calibri" w:hAnsi="Calibri" w:eastAsia="Calibri"/>
                 <w:b w:val="0"/>
-                <w:color w:val="265A61"/>
+                <w:color w:val="255E69"/>
                 <w:sz w:val="15"/>
               </w:rPr>
               <w:t>Добавить идемпотентные ключи для денежных и заявочных операций, версию записи для конфликтов и фоновую очередь только для безопасных черновиков. В интерфейсе показывать один общий индикатор синхронизации.</w:t>
+            </w:r>
+          </w:p>
+        </w:tc>
+      </w:tr>
+    </w:tbl>
+    <w:p>
+      <w:pPr>
+        <w:sectPr>
+          <w:pgSz w:w="15840" w:h="12240" w:orient="landscape"/>
+          <w:pgMar w:top="720" w:right="792" w:bottom="720" w:left="792" w:header="432" w:footer="432" w:gutter="0"/>
+          <w:cols w:space="720"/>
+          <w:docGrid w:linePitch="360"/>
+        </w:sectPr>
+      </w:pPr>
+    </w:p>
+    <w:p>
+      <w:pPr>
+        <w:spacing w:before="0" w:after="0"/>
+      </w:pPr>
+      <w:r>
+        <w:rPr>
+          <w:sz w:val="240"/>
+        </w:rPr>
+        <w:t xml:space="preserve"> </w:t>
+      </w:r>
+    </w:p>
+    <w:tbl>
+      <w:tblPr>
+        <w:tblW w:type="dxa" w:w="14136"/>
+        <w:jc w:val="left"/>
+        <w:tblLayout w:type="fixed"/>
+        <w:tblLook w:firstColumn="1" w:firstRow="1" w:lastColumn="0" w:lastRow="0" w:noHBand="0" w:noVBand="1" w:val="04A0"/>
+        <w:tblInd w:w="120" w:type="dxa"/>
+        <w:tblBorders>
+          <w:top w:val="single" w:sz="6" w:space="0" w:color="B8C4CE"/>
+          <w:left w:val="single" w:sz="6" w:space="0" w:color="B8C4CE"/>
+          <w:bottom w:val="single" w:sz="6" w:space="0" w:color="B8C4CE"/>
+          <w:right w:val="single" w:sz="6" w:space="0" w:color="B8C4CE"/>
+          <w:insideH w:val="single" w:sz="6" w:space="0" w:color="B8C4CE"/>
+          <w:insideV w:val="single" w:sz="6" w:space="0" w:color="B8C4CE"/>
+        </w:tblBorders>
+      </w:tblPr>
+      <w:tblGrid>
+        <w:gridCol w:w="2600"/>
+        <w:gridCol w:w="4200"/>
+        <w:gridCol w:w="1400"/>
+        <w:gridCol w:w="5936"/>
+      </w:tblGrid>
+      <w:tr>
+        <w:trPr>
+          <w:cantSplit/>
+        </w:trPr>
+        <w:tc>
+          <w:tcPr>
+            <w:tcW w:type="dxa" w:w="2600"/>
+            <w:vAlign w:val="center"/>
+            <w:tcMar>
+              <w:top w:w="70" w:type="dxa"/>
+              <w:bottom w:w="70" w:type="dxa"/>
+              <w:start w:w="100" w:type="dxa"/>
+              <w:end w:w="100" w:type="dxa"/>
+            </w:tcMar>
+            <w:shd w:fill="E8EEF5"/>
+          </w:tcPr>
+          <w:p>
+            <w:pPr>
+              <w:spacing w:before="0" w:after="0" w:line="240" w:lineRule="auto"/>
+              <w:jc w:val="center"/>
+            </w:pPr>
+            <w:r>
+              <w:rPr>
+                <w:rFonts w:ascii="Calibri" w:hAnsi="Calibri"/>
+                <w:b/>
+                <w:color w:val="1F4D78"/>
+                <w:sz w:val="16"/>
+              </w:rPr>
+              <w:t>Проверяемый функционал</w:t>
+            </w:r>
+          </w:p>
+        </w:tc>
+        <w:tc>
+          <w:tcPr>
+            <w:tcW w:type="dxa" w:w="4200"/>
+            <w:vAlign w:val="center"/>
+            <w:tcMar>
+              <w:top w:w="70" w:type="dxa"/>
+              <w:bottom w:w="70" w:type="dxa"/>
+              <w:start w:w="100" w:type="dxa"/>
+              <w:end w:w="100" w:type="dxa"/>
+            </w:tcMar>
+            <w:shd w:fill="E8EEF5"/>
+          </w:tcPr>
+          <w:p>
+            <w:pPr>
+              <w:spacing w:before="0" w:after="0" w:line="240" w:lineRule="auto"/>
+              <w:jc w:val="center"/>
+            </w:pPr>
+            <w:r>
+              <w:rPr>
+                <w:rFonts w:ascii="Calibri" w:hAnsi="Calibri"/>
+                <w:b/>
+                <w:color w:val="1F4D78"/>
+                <w:sz w:val="16"/>
+              </w:rPr>
+              <w:t>Как реализуется либо не реализуется в программе</w:t>
+            </w:r>
+          </w:p>
+        </w:tc>
+        <w:tc>
+          <w:tcPr>
+            <w:tcW w:type="dxa" w:w="1400"/>
+            <w:vAlign w:val="center"/>
+            <w:tcMar>
+              <w:top w:w="70" w:type="dxa"/>
+              <w:bottom w:w="70" w:type="dxa"/>
+              <w:start w:w="100" w:type="dxa"/>
+              <w:end w:w="100" w:type="dxa"/>
+            </w:tcMar>
+            <w:shd w:fill="E8EEF5"/>
+          </w:tcPr>
+          <w:p>
+            <w:pPr>
+              <w:spacing w:before="0" w:after="0" w:line="240" w:lineRule="auto"/>
+              <w:jc w:val="center"/>
+            </w:pPr>
+            <w:r>
+              <w:rPr>
+                <w:rFonts w:ascii="Calibri" w:hAnsi="Calibri"/>
+                <w:b/>
+                <w:color w:val="1F4D78"/>
+                <w:sz w:val="16"/>
+              </w:rPr>
+              <w:t>Статус</w:t>
+            </w:r>
+          </w:p>
+        </w:tc>
+        <w:tc>
+          <w:tcPr>
+            <w:tcW w:type="dxa" w:w="5936"/>
+            <w:vAlign w:val="center"/>
+            <w:tcMar>
+              <w:top w:w="70" w:type="dxa"/>
+              <w:bottom w:w="70" w:type="dxa"/>
+              <w:start w:w="100" w:type="dxa"/>
+              <w:end w:w="100" w:type="dxa"/>
+            </w:tcMar>
+            <w:shd w:fill="E8EEF5"/>
+          </w:tcPr>
+          <w:p>
+            <w:pPr>
+              <w:spacing w:before="0" w:after="0" w:line="240" w:lineRule="auto"/>
+              <w:jc w:val="center"/>
+            </w:pPr>
+            <w:r>
+              <w:rPr>
+                <w:rFonts w:ascii="Calibri" w:hAnsi="Calibri"/>
+                <w:b/>
+                <w:color w:val="1F4D78"/>
+                <w:sz w:val="16"/>
+              </w:rPr>
+              <w:t>Предлагаемое решение без усложнения интерфейса</w:t>
             </w:r>
           </w:p>
         </w:tc>
@@ -4891,9 +5280,9 @@
             </w:pPr>
             <w:r>
               <w:rPr>
-                <w:rFonts w:ascii="Calibri" w:hAnsi="Calibri"/>
+                <w:rFonts w:ascii="Calibri" w:hAnsi="Calibri" w:eastAsia="Calibri"/>
                 <w:b/>
-                <w:color w:val="2E74B5"/>
+                <w:color w:val="0070C0"/>
                 <w:sz w:val="15"/>
               </w:rPr>
               <w:t>SEC-05. Резервное копирование и восстановление</w:t>
@@ -4918,9 +5307,9 @@
             </w:pPr>
             <w:r>
               <w:rPr>
-                <w:rFonts w:ascii="Calibri" w:hAnsi="Calibri"/>
+                <w:rFonts w:ascii="Calibri" w:hAnsi="Calibri" w:eastAsia="Calibri"/>
                 <w:b w:val="0"/>
-                <w:color w:val="243447"/>
+                <w:color w:val="24364B"/>
                 <w:sz w:val="15"/>
               </w:rPr>
               <w:t>Есть скрипты backup/restore, инструкция, миграции при старте и рекомендация отдельно копировать файловое хранилище. Нет автоматического расписания, контроля RPO/RTO и сохраненного протокола регулярной проверки восстановления.</w:t>
@@ -4946,9 +5335,9 @@
             </w:pPr>
             <w:r>
               <w:rPr>
-                <w:rFonts w:ascii="Calibri" w:hAnsi="Calibri"/>
+                <w:rFonts w:ascii="Calibri" w:hAnsi="Calibri" w:eastAsia="Calibri"/>
                 <w:b/>
-                <w:color w:val="7A5A00"/>
+                <w:color w:val="7F6000"/>
                 <w:sz w:val="15"/>
               </w:rPr>
               <w:t>Частично</w:t>
@@ -4973,9 +5362,9 @@
             </w:pPr>
             <w:r>
               <w:rPr>
-                <w:rFonts w:ascii="Calibri" w:hAnsi="Calibri"/>
+                <w:rFonts w:ascii="Calibri" w:hAnsi="Calibri" w:eastAsia="Calibri"/>
                 <w:b w:val="0"/>
-                <w:color w:val="265A61"/>
+                <w:color w:val="255E69"/>
                 <w:sz w:val="15"/>
               </w:rPr>
               <w:t>Настроить плановые резервные копии базы и файлов, манифест целостности и регулярный тест восстановления. В панели председателя показывать только краткий индикатор здоровья резервирования.</w:t>
@@ -5005,9 +5394,9 @@
             </w:pPr>
             <w:r>
               <w:rPr>
-                <w:rFonts w:ascii="Calibri" w:hAnsi="Calibri"/>
+                <w:rFonts w:ascii="Calibri" w:hAnsi="Calibri" w:eastAsia="Calibri"/>
                 <w:b/>
-                <w:color w:val="2E74B5"/>
+                <w:color w:val="0070C0"/>
                 <w:sz w:val="15"/>
               </w:rPr>
               <w:t>SEC-06. Экспорт, исправление и сроки хранения персональных данных</w:t>
@@ -5032,9 +5421,9 @@
             </w:pPr>
             <w:r>
               <w:rPr>
-                <w:rFonts w:ascii="Calibri" w:hAnsi="Calibri"/>
+                <w:rFonts w:ascii="Calibri" w:hAnsi="Calibri" w:eastAsia="Calibri"/>
                 <w:b w:val="0"/>
-                <w:color w:val="243447"/>
+                <w:color w:val="24364B"/>
                 <w:sz w:val="15"/>
               </w:rPr>
               <w:t>Пользователь может изменить контактные настройки и закрыть публикацию объявления или профиля. Нет полного экспорта данных субъекта, управляемого исправления во всех реестрах, отзыва согласия, политики сроков хранения и обезличивания бывшего участника.</w:t>
@@ -5060,9 +5449,9 @@
             </w:pPr>
             <w:r>
               <w:rPr>
-                <w:rFonts w:ascii="Calibri" w:hAnsi="Calibri"/>
+                <w:rFonts w:ascii="Calibri" w:hAnsi="Calibri" w:eastAsia="Calibri"/>
                 <w:b/>
-                <w:color w:val="7A5A00"/>
+                <w:color w:val="7F6000"/>
                 <w:sz w:val="15"/>
               </w:rPr>
               <w:t>Частично</w:t>
@@ -5087,9 +5476,9 @@
             </w:pPr>
             <w:r>
               <w:rPr>
-                <w:rFonts w:ascii="Calibri" w:hAnsi="Calibri"/>
+                <w:rFonts w:ascii="Calibri" w:hAnsi="Calibri" w:eastAsia="Calibri"/>
                 <w:b w:val="0"/>
-                <w:color w:val="265A61"/>
+                <w:color w:val="255E69"/>
                 <w:sz w:val="15"/>
               </w:rPr>
               <w:t>Добавить фоновый экспорт данных, журнал согласий, правила хранения и сценарий обезличивания из карточки участника. Пользователю оставить одно действие «Мои данные и согласия».</w:t>

</xml_diff>